<commit_message>
sprint 1 i 2
</commit_message>
<xml_diff>
--- a/backlog/Sprint_1.docx
+++ b/backlog/Sprint_1.docx
@@ -1,185 +1,889 @@
 
 <file path=word/document.xml><?xml version="1.0" encoding="utf-8"?>
-<w:document xmlns:wpc="http://schemas.microsoft.com/office/word/2010/wordprocessingCanvas" xmlns:cx="http://schemas.microsoft.com/office/drawing/2014/chartex" xmlns:cx1="http://schemas.microsoft.com/office/drawing/2015/9/8/chartex" xmlns:cx2="http://schemas.microsoft.com/office/drawing/2015/10/21/chartex" xmlns:cx3="http://schemas.microsoft.com/office/drawing/2016/5/9/chartex" xmlns:cx4="http://schemas.microsoft.com/office/drawing/2016/5/10/chartex" xmlns:cx5="http://schemas.microsoft.com/office/drawing/2016/5/11/chartex" xmlns:cx6="http://schemas.microsoft.com/office/drawing/2016/5/12/chartex" xmlns:cx7="http://schemas.microsoft.com/office/drawing/2016/5/13/chartex" xmlns:cx8="http://schemas.microsoft.com/office/drawing/2016/5/14/chartex" xmlns:mc="http://schemas.openxmlformats.org/markup-compatibility/2006" xmlns:aink="http://schemas.microsoft.com/office/drawing/2016/ink" xmlns:am3d="http://schemas.microsoft.com/office/drawing/2017/model3d" xmlns:o="urn:schemas-microsoft-com:office:office" xmlns:oel="http://schemas.microsoft.com/office/2019/extlst" xmlns:r="http://schemas.openxmlformats.org/officeDocument/2006/relationships" xmlns:m="http://schemas.openxmlformats.org/officeDocument/2006/math" xmlns:v="urn:schemas-microsoft-com:vml" xmlns:wp14="http://schemas.microsoft.com/office/word/2010/wordprocessingDrawing" xmlns:wp="http://schemas.openxmlformats.org/drawingml/2006/wordprocessingDrawing" xmlns:w10="urn:schemas-microsoft-com:office:word" xmlns:w="http://schemas.openxmlformats.org/wordprocessingml/2006/main" xmlns:w14="http://schemas.microsoft.com/office/word/2010/wordml" xmlns:w15="http://schemas.microsoft.com/office/word/2012/wordml" xmlns:w16cex="http://schemas.microsoft.com/office/word/2018/wordml/cex" xmlns:w16cid="http://schemas.microsoft.com/office/word/2016/wordml/cid" xmlns:w16="http://schemas.microsoft.com/office/word/2018/wordml" xmlns:w16du="http://schemas.microsoft.com/office/word/2023/wordml/word16du" xmlns:w16sdtdh="http://schemas.microsoft.com/office/word/2020/wordml/sdtdatahash" xmlns:w16sdtfl="http://schemas.microsoft.com/office/word/2024/wordml/sdtformatlock" xmlns:w16se="http://schemas.microsoft.com/office/word/2015/wordml/symex" xmlns:wpg="http://schemas.microsoft.com/office/word/2010/wordprocessingGroup" xmlns:wpi="http://schemas.microsoft.com/office/word/2010/wordprocessingInk" xmlns:wne="http://schemas.microsoft.com/office/word/2006/wordml" xmlns:wps="http://schemas.microsoft.com/office/word/2010/wordprocessingShape" mc:Ignorable="w14 w15 w16se w16cid w16 w16cex w16sdtdh w16sdtfl w16du wp14">
+<w:document xmlns:wpc="http://schemas.microsoft.com/office/word/2010/wordprocessingCanvas" xmlns:mc="http://schemas.openxmlformats.org/markup-compatibility/2006" xmlns:o="urn:schemas-microsoft-com:office:office" xmlns:r="http://schemas.openxmlformats.org/officeDocument/2006/relationships" xmlns:m="http://schemas.openxmlformats.org/officeDocument/2006/math" xmlns:v="urn:schemas-microsoft-com:vml" xmlns:wp14="http://schemas.microsoft.com/office/word/2010/wordprocessingDrawing" xmlns:wp="http://schemas.openxmlformats.org/drawingml/2006/wordprocessingDrawing" xmlns:w10="urn:schemas-microsoft-com:office:word" xmlns:w="http://schemas.openxmlformats.org/wordprocessingml/2006/main" xmlns:w14="http://schemas.microsoft.com/office/word/2010/wordml" xmlns:wpg="http://schemas.microsoft.com/office/word/2010/wordprocessingGroup" xmlns:wpi="http://schemas.microsoft.com/office/word/2010/wordprocessingInk" xmlns:wne="http://schemas.microsoft.com/office/word/2006/wordml" xmlns:wps="http://schemas.microsoft.com/office/word/2010/wordprocessingShape" mc:Ignorable="w14 wp14">
   <w:body>
-    <w:p/>
-    <w:p>
-      <w:r>
-        <w:t>Członkowie zespołu:</w:t>
-      </w:r>
-    </w:p>
-    <w:p>
-      <w:r>
-        <w:t xml:space="preserve">Jakub Wołczko: Product </w:t>
-      </w:r>
-      <w:proofErr w:type="spellStart"/>
-      <w:r>
-        <w:t>Owner</w:t>
-      </w:r>
-      <w:proofErr w:type="spellEnd"/>
-      <w:r>
-        <w:t xml:space="preserve">, </w:t>
-      </w:r>
-      <w:proofErr w:type="spellStart"/>
-      <w:r>
-        <w:t>Scrum</w:t>
-      </w:r>
-      <w:proofErr w:type="spellEnd"/>
-      <w:r>
-        <w:t xml:space="preserve"> Master</w:t>
-      </w:r>
-    </w:p>
-    <w:p>
-      <w:r>
-        <w:t xml:space="preserve">Jakub </w:t>
-      </w:r>
-      <w:proofErr w:type="spellStart"/>
-      <w:r>
-        <w:t>Łaszuk</w:t>
-      </w:r>
-      <w:proofErr w:type="spellEnd"/>
-    </w:p>
-    <w:p>
-      <w:r>
-        <w:t xml:space="preserve">Ksenia </w:t>
-      </w:r>
-      <w:proofErr w:type="spellStart"/>
-      <w:r>
-        <w:t>Makarevich</w:t>
-      </w:r>
-      <w:proofErr w:type="spellEnd"/>
-    </w:p>
-    <w:p>
-      <w:r>
-        <w:t>Michał Nuckowski</w:t>
-      </w:r>
-    </w:p>
-    <w:p>
-      <w:r>
-        <w:t>Dawid Olszewski</w:t>
-      </w:r>
-    </w:p>
-    <w:p>
-      <w:r>
-        <w:t xml:space="preserve">Nikola </w:t>
-      </w:r>
-      <w:proofErr w:type="spellStart"/>
-      <w:r>
-        <w:t>Ruczyńska</w:t>
-      </w:r>
-      <w:proofErr w:type="spellEnd"/>
-    </w:p>
-    <w:p>
-      <w:r>
-        <w:t xml:space="preserve">Jeremiasz </w:t>
-      </w:r>
-      <w:proofErr w:type="spellStart"/>
-      <w:r>
-        <w:t>Kubryn</w:t>
-      </w:r>
-      <w:proofErr w:type="spellEnd"/>
-    </w:p>
-    <w:p/>
-    <w:p>
-      <w:r>
-        <w:t xml:space="preserve">Sprint </w:t>
-      </w:r>
-      <w:proofErr w:type="spellStart"/>
-      <w:r>
-        <w:t>Backlog</w:t>
-      </w:r>
-      <w:proofErr w:type="spellEnd"/>
-      <w:r>
-        <w:t>:</w:t>
-      </w:r>
-    </w:p>
-    <w:p>
-      <w:r>
-        <w:t>Sprint 1 – Fundamenty projektu i architektura</w:t>
-      </w:r>
-      <w:r>
-        <w:br/>
-        <w:t>Cel: przygotowanie środowiska i architektury aplikacji.</w:t>
-      </w:r>
-    </w:p>
-    <w:p>
-      <w:r>
-        <w:t>Historyjki:</w:t>
-      </w:r>
-    </w:p>
-    <w:p>
-      <w:r>
-        <w:br/>
-        <w:t xml:space="preserve">-  S1-01 Jako zespół chcemy architekturę </w:t>
-      </w:r>
-      <w:proofErr w:type="spellStart"/>
-      <w:r>
-        <w:t>backendu</w:t>
-      </w:r>
-      <w:proofErr w:type="spellEnd"/>
-      <w:r>
-        <w:t xml:space="preserve"> opartą o wzorzec CQRS.</w:t>
-      </w:r>
-      <w:r>
-        <w:br/>
-        <w:t xml:space="preserve">-  S1-02 Jako zespół chcemy przygotować podstawowy </w:t>
-      </w:r>
-      <w:proofErr w:type="spellStart"/>
-      <w:r>
-        <w:t>frontend</w:t>
-      </w:r>
-      <w:proofErr w:type="spellEnd"/>
-      <w:r>
-        <w:t>, aby rozpocząć budowę UI.</w:t>
-      </w:r>
-      <w:r>
-        <w:br/>
-        <w:t>-  S1-03 Jako zespół chcemy skonfigurować API, aby aplikacja miała punkt startowy.</w:t>
-      </w:r>
-      <w:r>
-        <w:br/>
-        <w:t>-  S1-04 Jako zespół chcemy przygotować bazę danych i model ERD.</w:t>
-      </w:r>
-      <w:r>
-        <w:br/>
-        <w:t>-  S1-05 Jako zespół chcemy przygotować dokumentację uruchomieniową projektu.</w:t>
-      </w:r>
-    </w:p>
-    <w:p/>
-    <w:p>
-      <w:r>
-        <w:t xml:space="preserve">Sprint </w:t>
-      </w:r>
-      <w:proofErr w:type="spellStart"/>
-      <w:r>
-        <w:t>review</w:t>
-      </w:r>
-      <w:proofErr w:type="spellEnd"/>
-      <w:r>
-        <w:t>:</w:t>
-      </w:r>
-    </w:p>
-    <w:p>
-      <w:r>
-        <w:t>Co się udało?</w:t>
-      </w:r>
-    </w:p>
-    <w:p/>
-    <w:p>
-      <w:r>
-        <w:t xml:space="preserve">Sprint </w:t>
-      </w:r>
-      <w:proofErr w:type="spellStart"/>
-      <w:r>
-        <w:t>retrospective</w:t>
-      </w:r>
-      <w:proofErr w:type="spellEnd"/>
-      <w:r>
-        <w:t>:</w:t>
-      </w:r>
-    </w:p>
-    <w:p/>
-    <w:p/>
+    <w:p>
+      <w:pPr>
+        <w:pStyle w:val="Title"/>
+      </w:pPr>
+      <w:r>
+        <w:rPr>
+          <w:b/>
+        </w:rPr>
+        <w:t xml:space="preserve">Calisia Banking App</w:t>
+      </w:r>
+    </w:p>
+    <w:p>
+      <w:pPr>
+        <w:pStyle w:val="Heading1"/>
+      </w:pPr>
+      <w:r>
+        <w:rPr>
+          <w:b/>
+        </w:rPr>
+        <w:t xml:space="preserve">Członkowie zespołu</w:t>
+      </w:r>
+    </w:p>
+    <w:p>
+      <w:r>
+        <w:t xml:space="preserve">Kubryn Jeremiasz</w:t>
+      </w:r>
+    </w:p>
+    <w:p>
+      <w:r>
+        <w:t xml:space="preserve">Łaszuk Jakub</w:t>
+      </w:r>
+    </w:p>
+    <w:p>
+      <w:r>
+        <w:t xml:space="preserve">Makarevich Ksenia</w:t>
+      </w:r>
+    </w:p>
+    <w:p>
+      <w:r>
+        <w:t xml:space="preserve">Nuckowski Michał</w:t>
+      </w:r>
+    </w:p>
+    <w:p>
+      <w:r>
+        <w:t xml:space="preserve">Ruczyńska Nikola</w:t>
+      </w:r>
+    </w:p>
+    <w:p>
+      <w:r>
+        <w:t xml:space="preserve">Wołczko Jakub</w:t>
+      </w:r>
+    </w:p>
+    <w:p>
+      <w:pPr>
+        <w:pStyle w:val="Heading1"/>
+      </w:pPr>
+      <w:r>
+        <w:rPr>
+          <w:b/>
+        </w:rPr>
+        <w:t xml:space="preserve">Raport ze sprintu nr 1</w:t>
+      </w:r>
+    </w:p>
+    <w:p>
+      <w:r>
+        <w:t xml:space="preserve">Data: 03.05.2026</w:t>
+      </w:r>
+    </w:p>
+    <w:p>
+      <w:r>
+        <w:t xml:space="preserve">Product Owner &amp; Scrum Master: Jakub Wołczko</w:t>
+      </w:r>
+    </w:p>
+    <w:p>
+      <w:r>
+        <w:t xml:space="preserve">28.04 - 03.05.2026</w:t>
+      </w:r>
+    </w:p>
+    <w:p>
+      <w:r>
+        <w:t xml:space="preserve">Jakub Wołczko</w:t>
+      </w:r>
+    </w:p>
+    <w:p>
+      <w:pPr>
+        <w:pStyle w:val="Heading1"/>
+      </w:pPr>
+      <w:r>
+        <w:rPr>
+          <w:b/>
+        </w:rPr>
+        <w:t xml:space="preserve">1. Sprint Planning</w:t>
+      </w:r>
+    </w:p>
+    <w:p>
+      <w:r>
+        <w:t xml:space="preserve">1.1. Cel Sprintu: Fundamenty architektury i środowiska. Przygotowanie technicznego fundamentu aplikacji, aby zespół mógł rozwijać backend, frontend i bazy danych w jednym spójnym projekcie.</w:t>
+      </w:r>
+    </w:p>
+    <w:p>
+      <w:pPr>
+        <w:pStyle w:val="Heading2"/>
+      </w:pPr>
+      <w:r>
+        <w:rPr>
+          <w:b/>
+        </w:rPr>
+        <w:t xml:space="preserve">1.2. Wybrane zadania z Backlogu:</w:t>
+      </w:r>
+    </w:p>
+    <w:tbl>
+      <w:tblPr>
+        <w:tblBorders>
+          <w:top w:val="single" w:sz="4" w:space="0" w:color="auto"/>
+          <w:left w:val="single" w:sz="4" w:space="0" w:color="auto"/>
+          <w:bottom w:val="single" w:sz="4" w:space="0" w:color="auto"/>
+          <w:right w:val="single" w:sz="4" w:space="0" w:color="auto"/>
+          <w:insideH w:val="single" w:sz="4" w:space="0" w:color="auto"/>
+          <w:insideV w:val="single" w:sz="4" w:space="0" w:color="auto"/>
+        </w:tblBorders>
+      </w:tblPr>
+      <w:tr>
+        <w:tc>
+          <w:tcPr/>
+          <w:p>
+            <w:r>
+              <w:rPr>
+                <w:b/>
+              </w:rPr>
+              <w:t xml:space="preserve">L.p.</w:t>
+            </w:r>
+          </w:p>
+        </w:tc>
+        <w:tc>
+          <w:tcPr/>
+          <w:p>
+            <w:r>
+              <w:rPr>
+                <w:b/>
+              </w:rPr>
+              <w:t xml:space="preserve">Kod</w:t>
+            </w:r>
+          </w:p>
+        </w:tc>
+        <w:tc>
+          <w:tcPr/>
+          <w:p>
+            <w:r>
+              <w:rPr>
+                <w:b/>
+              </w:rPr>
+              <w:t xml:space="preserve">Nazwa zadania</w:t>
+            </w:r>
+          </w:p>
+        </w:tc>
+        <w:tc>
+          <w:tcPr/>
+          <w:p>
+            <w:r>
+              <w:rPr>
+                <w:b/>
+              </w:rPr>
+              <w:t xml:space="preserve">Punkty</w:t>
+            </w:r>
+          </w:p>
+        </w:tc>
+      </w:tr>
+      <w:tr>
+        <w:tc>
+          <w:tcPr/>
+          <w:p>
+            <w:r>
+              <w:t xml:space="preserve">1</w:t>
+            </w:r>
+          </w:p>
+        </w:tc>
+        <w:tc>
+          <w:tcPr/>
+          <w:p>
+            <w:r>
+              <w:t xml:space="preserve">S1-01</w:t>
+            </w:r>
+          </w:p>
+        </w:tc>
+        <w:tc>
+          <w:tcPr/>
+          <w:p>
+            <w:r>
+              <w:t xml:space="preserve">Przygotowanie solucji backendowej z warstwami Api, Application, Domain, Infrastructure, Contracts i ReadModel</w:t>
+            </w:r>
+          </w:p>
+        </w:tc>
+        <w:tc>
+          <w:tcPr/>
+          <w:p>
+            <w:r>
+              <w:t xml:space="preserve">8</w:t>
+            </w:r>
+          </w:p>
+        </w:tc>
+      </w:tr>
+      <w:tr>
+        <w:tc>
+          <w:tcPr/>
+          <w:p>
+            <w:r>
+              <w:t xml:space="preserve">2</w:t>
+            </w:r>
+          </w:p>
+        </w:tc>
+        <w:tc>
+          <w:tcPr/>
+          <w:p>
+            <w:r>
+              <w:t xml:space="preserve">S1-02</w:t>
+            </w:r>
+          </w:p>
+        </w:tc>
+        <w:tc>
+          <w:tcPr/>
+          <w:p>
+            <w:r>
+              <w:t xml:space="preserve">Wdrożenie wzorca CQRS dla komend i zapytań</w:t>
+            </w:r>
+          </w:p>
+        </w:tc>
+        <w:tc>
+          <w:tcPr/>
+          <w:p>
+            <w:r>
+              <w:t xml:space="preserve">8</w:t>
+            </w:r>
+          </w:p>
+        </w:tc>
+      </w:tr>
+      <w:tr>
+        <w:tc>
+          <w:tcPr/>
+          <w:p>
+            <w:r>
+              <w:t xml:space="preserve">3</w:t>
+            </w:r>
+          </w:p>
+        </w:tc>
+        <w:tc>
+          <w:tcPr/>
+          <w:p>
+            <w:r>
+              <w:t xml:space="preserve">S1-03</w:t>
+            </w:r>
+          </w:p>
+        </w:tc>
+        <w:tc>
+          <w:tcPr/>
+          <w:p>
+            <w:r>
+              <w:t xml:space="preserve">Konfiguracja projektu frontendowego React/Vite z routingiem, stylami globalnymi i layoutami</w:t>
+            </w:r>
+          </w:p>
+        </w:tc>
+        <w:tc>
+          <w:tcPr/>
+          <w:p>
+            <w:r>
+              <w:t xml:space="preserve">5</w:t>
+            </w:r>
+          </w:p>
+        </w:tc>
+      </w:tr>
+      <w:tr>
+        <w:tc>
+          <w:tcPr/>
+          <w:p>
+            <w:r>
+              <w:t xml:space="preserve">4</w:t>
+            </w:r>
+          </w:p>
+        </w:tc>
+        <w:tc>
+          <w:tcPr/>
+          <w:p>
+            <w:r>
+              <w:t xml:space="preserve">S1-04</w:t>
+            </w:r>
+          </w:p>
+        </w:tc>
+        <w:tc>
+          <w:tcPr/>
+          <w:p>
+            <w:r>
+              <w:t xml:space="preserve">Przygotowanie skryptów baz CalisiaWriteDb i CalisiaReadDb</w:t>
+            </w:r>
+          </w:p>
+        </w:tc>
+        <w:tc>
+          <w:tcPr/>
+          <w:p>
+            <w:r>
+              <w:t xml:space="preserve">5</w:t>
+            </w:r>
+          </w:p>
+        </w:tc>
+      </w:tr>
+      <w:tr>
+        <w:tc>
+          <w:tcPr/>
+          <w:p>
+            <w:r>
+              <w:t xml:space="preserve">5</w:t>
+            </w:r>
+          </w:p>
+        </w:tc>
+        <w:tc>
+          <w:tcPr/>
+          <w:p>
+            <w:r>
+              <w:t xml:space="preserve">S1-05</w:t>
+            </w:r>
+          </w:p>
+        </w:tc>
+        <w:tc>
+          <w:tcPr/>
+          <w:p>
+            <w:r>
+              <w:t xml:space="preserve">Dodanie dokumentacji uruchomieniowej w README</w:t>
+            </w:r>
+          </w:p>
+        </w:tc>
+        <w:tc>
+          <w:tcPr/>
+          <w:p>
+            <w:r>
+              <w:t xml:space="preserve">3</w:t>
+            </w:r>
+          </w:p>
+        </w:tc>
+      </w:tr>
+      <w:tr>
+        <w:tc>
+          <w:tcPr/>
+          <w:p>
+            <w:r>
+              <w:t xml:space="preserve">6</w:t>
+            </w:r>
+          </w:p>
+        </w:tc>
+        <w:tc>
+          <w:tcPr/>
+          <w:p>
+            <w:r>
+              <w:t xml:space="preserve">S1-06</w:t>
+            </w:r>
+          </w:p>
+        </w:tc>
+        <w:tc>
+          <w:tcPr/>
+          <w:p>
+            <w:r>
+              <w:t xml:space="preserve">Przygotowanie kolekcji Bruno dla podstawowych endpointów</w:t>
+            </w:r>
+          </w:p>
+        </w:tc>
+        <w:tc>
+          <w:tcPr/>
+          <w:p>
+            <w:r>
+              <w:t xml:space="preserve">3</w:t>
+            </w:r>
+          </w:p>
+        </w:tc>
+      </w:tr>
+    </w:tbl>
+    <w:p>
+      <w:r>
+        <w:t xml:space="preserve">1.3. Zadeklarowana pojemność (Velocity): 32 Story Points.</w:t>
+      </w:r>
+    </w:p>
+    <w:p>
+      <w:pPr>
+        <w:pStyle w:val="Heading1"/>
+      </w:pPr>
+      <w:r>
+        <w:rPr>
+          <w:b/>
+        </w:rPr>
+        <w:t xml:space="preserve">2. Sprint Review</w:t>
+      </w:r>
+    </w:p>
+    <w:p>
+      <w:r>
+        <w:t xml:space="preserve">2.1. Status zadań: Wszystkie wybrane zostały wykonane.</w:t>
+      </w:r>
+    </w:p>
+    <w:tbl>
+      <w:tblPr>
+        <w:tblBorders>
+          <w:top w:val="single" w:sz="4" w:space="0" w:color="auto"/>
+          <w:left w:val="single" w:sz="4" w:space="0" w:color="auto"/>
+          <w:bottom w:val="single" w:sz="4" w:space="0" w:color="auto"/>
+          <w:right w:val="single" w:sz="4" w:space="0" w:color="auto"/>
+          <w:insideH w:val="single" w:sz="4" w:space="0" w:color="auto"/>
+          <w:insideV w:val="single" w:sz="4" w:space="0" w:color="auto"/>
+        </w:tblBorders>
+      </w:tblPr>
+      <w:tr>
+        <w:tc>
+          <w:tcPr/>
+          <w:p>
+            <w:r>
+              <w:rPr>
+                <w:b/>
+              </w:rPr>
+              <w:t xml:space="preserve">L.p.</w:t>
+            </w:r>
+          </w:p>
+        </w:tc>
+        <w:tc>
+          <w:tcPr/>
+          <w:p>
+            <w:r>
+              <w:rPr>
+                <w:b/>
+              </w:rPr>
+              <w:t xml:space="preserve">Zadanie</w:t>
+            </w:r>
+          </w:p>
+        </w:tc>
+        <w:tc>
+          <w:tcPr/>
+          <w:p>
+            <w:r>
+              <w:rPr>
+                <w:b/>
+              </w:rPr>
+              <w:t xml:space="preserve">Status</w:t>
+            </w:r>
+          </w:p>
+        </w:tc>
+        <w:tc>
+          <w:tcPr/>
+          <w:p>
+            <w:r>
+              <w:rPr>
+                <w:b/>
+              </w:rPr>
+              <w:t xml:space="preserve">Uwagi</w:t>
+            </w:r>
+          </w:p>
+        </w:tc>
+      </w:tr>
+      <w:tr>
+        <w:tc>
+          <w:tcPr/>
+          <w:p>
+            <w:r>
+              <w:t xml:space="preserve">1</w:t>
+            </w:r>
+          </w:p>
+        </w:tc>
+        <w:tc>
+          <w:tcPr/>
+          <w:p>
+            <w:r>
+              <w:t xml:space="preserve">Przygotowanie solucji backendowej z warstwami Api, Application, Domain, Infrastructure, Contracts i ReadModel</w:t>
+            </w:r>
+          </w:p>
+        </w:tc>
+        <w:tc>
+          <w:tcPr/>
+          <w:p>
+            <w:r>
+              <w:t xml:space="preserve">Done</w:t>
+            </w:r>
+          </w:p>
+        </w:tc>
+        <w:tc>
+          <w:tcPr/>
+          <w:p>
+            <w:r>
+              <w:t xml:space="preserve">Brak</w:t>
+            </w:r>
+          </w:p>
+        </w:tc>
+      </w:tr>
+      <w:tr>
+        <w:tc>
+          <w:tcPr/>
+          <w:p>
+            <w:r>
+              <w:t xml:space="preserve">2</w:t>
+            </w:r>
+          </w:p>
+        </w:tc>
+        <w:tc>
+          <w:tcPr/>
+          <w:p>
+            <w:r>
+              <w:t xml:space="preserve">Wdrożenie wzorca CQRS dla komend i zapytań</w:t>
+            </w:r>
+          </w:p>
+        </w:tc>
+        <w:tc>
+          <w:tcPr/>
+          <w:p>
+            <w:r>
+              <w:t xml:space="preserve">Done</w:t>
+            </w:r>
+          </w:p>
+        </w:tc>
+        <w:tc>
+          <w:tcPr/>
+          <w:p>
+            <w:r>
+              <w:t xml:space="preserve">Brak</w:t>
+            </w:r>
+          </w:p>
+        </w:tc>
+      </w:tr>
+      <w:tr>
+        <w:tc>
+          <w:tcPr/>
+          <w:p>
+            <w:r>
+              <w:t xml:space="preserve">3</w:t>
+            </w:r>
+          </w:p>
+        </w:tc>
+        <w:tc>
+          <w:tcPr/>
+          <w:p>
+            <w:r>
+              <w:t xml:space="preserve">Konfiguracja projektu frontendowego React/Vite z routingiem, stylami globalnymi i layoutami</w:t>
+            </w:r>
+          </w:p>
+        </w:tc>
+        <w:tc>
+          <w:tcPr/>
+          <w:p>
+            <w:r>
+              <w:t xml:space="preserve">Done</w:t>
+            </w:r>
+          </w:p>
+        </w:tc>
+        <w:tc>
+          <w:tcPr/>
+          <w:p>
+            <w:r>
+              <w:t xml:space="preserve">Brak</w:t>
+            </w:r>
+          </w:p>
+        </w:tc>
+      </w:tr>
+      <w:tr>
+        <w:tc>
+          <w:tcPr/>
+          <w:p>
+            <w:r>
+              <w:t xml:space="preserve">4</w:t>
+            </w:r>
+          </w:p>
+        </w:tc>
+        <w:tc>
+          <w:tcPr/>
+          <w:p>
+            <w:r>
+              <w:t xml:space="preserve">Przygotowanie skryptów baz CalisiaWriteDb i CalisiaReadDb</w:t>
+            </w:r>
+          </w:p>
+        </w:tc>
+        <w:tc>
+          <w:tcPr/>
+          <w:p>
+            <w:r>
+              <w:t xml:space="preserve">Done</w:t>
+            </w:r>
+          </w:p>
+        </w:tc>
+        <w:tc>
+          <w:tcPr/>
+          <w:p>
+            <w:r>
+              <w:t xml:space="preserve">Brak</w:t>
+            </w:r>
+          </w:p>
+        </w:tc>
+      </w:tr>
+      <w:tr>
+        <w:tc>
+          <w:tcPr/>
+          <w:p>
+            <w:r>
+              <w:t xml:space="preserve">5</w:t>
+            </w:r>
+          </w:p>
+        </w:tc>
+        <w:tc>
+          <w:tcPr/>
+          <w:p>
+            <w:r>
+              <w:t xml:space="preserve">Dodanie dokumentacji uruchomieniowej w README</w:t>
+            </w:r>
+          </w:p>
+        </w:tc>
+        <w:tc>
+          <w:tcPr/>
+          <w:p>
+            <w:r>
+              <w:t xml:space="preserve">Done</w:t>
+            </w:r>
+          </w:p>
+        </w:tc>
+        <w:tc>
+          <w:tcPr/>
+          <w:p>
+            <w:r>
+              <w:t xml:space="preserve">Brak</w:t>
+            </w:r>
+          </w:p>
+        </w:tc>
+      </w:tr>
+      <w:tr>
+        <w:tc>
+          <w:tcPr/>
+          <w:p>
+            <w:r>
+              <w:t xml:space="preserve">6</w:t>
+            </w:r>
+          </w:p>
+        </w:tc>
+        <w:tc>
+          <w:tcPr/>
+          <w:p>
+            <w:r>
+              <w:t xml:space="preserve">Przygotowanie kolekcji Bruno dla podstawowych endpointów</w:t>
+            </w:r>
+          </w:p>
+        </w:tc>
+        <w:tc>
+          <w:tcPr/>
+          <w:p>
+            <w:r>
+              <w:t xml:space="preserve">Done</w:t>
+            </w:r>
+          </w:p>
+        </w:tc>
+        <w:tc>
+          <w:tcPr/>
+          <w:p>
+            <w:r>
+              <w:t xml:space="preserve">Brak</w:t>
+            </w:r>
+          </w:p>
+        </w:tc>
+      </w:tr>
+    </w:tbl>
+    <w:p>
+      <w:r>
+        <w:t xml:space="preserve">2.2. Demo / Przyrost (Increment): Przygotowano kompletna baze techniczna projektu: wielowarstwowa solucje backendowa, podstawowe abstrakcje CQRS, projekt frontendowy React/Vite, skrypty baz danych, dokumentacje uruchomieniowa oraz poczatkowa kolekcje Bruno do weryfikacji API.</w:t>
+      </w:r>
+    </w:p>
+    <w:p>
+      <w:r>
+        <w:t xml:space="preserve">2.3. Osiągnięta prędkość: 32 SP.</w:t>
+      </w:r>
+    </w:p>
+    <w:p>
+      <w:pPr>
+        <w:pStyle w:val="Heading1"/>
+      </w:pPr>
+      <w:r>
+        <w:rPr>
+          <w:b/>
+        </w:rPr>
+        <w:t xml:space="preserve">3. Sprint Retrospective</w:t>
+      </w:r>
+    </w:p>
+    <w:p>
+      <w:pPr>
+        <w:pStyle w:val="Heading2"/>
+      </w:pPr>
+      <w:r>
+        <w:rPr>
+          <w:b/>
+        </w:rPr>
+        <w:t xml:space="preserve">3.1. Poziom energii</w:t>
+      </w:r>
+    </w:p>
+    <w:p>
+      <w:r>
+        <w:t xml:space="preserve">W ramach retrospektywy sprintu przeprowadzono ocene poziomu energii członków zespółu.</w:t>
+      </w:r>
+    </w:p>
+    <w:p>
+      <w:r>
+        <w:t xml:space="preserve">Średni poziom energii podczas sprintu zostal oceniony na: 4,1/5</w:t>
+      </w:r>
+    </w:p>
+    <w:p>
+      <w:r>
+        <w:t xml:space="preserve">Uzyskane wyniki wskazuja, ze poziom zaangażowania oraz samopoczucia zespółu mial wplyw na efektywność realizacji sprintu, komunikację między członkami zespółu oraz tempo wykonywania zadań.</w:t>
+      </w:r>
+    </w:p>
+    <w:p>
+      <w:r>
+        <w:t xml:space="preserve">Najważniejsze czynniki wpływające na poziom energii zespółu:</w:t>
+      </w:r>
+    </w:p>
+    <w:p>
+      <w:r>
+        <w:t xml:space="preserve">Jasno określony cel sprintu i realistyczny zakres zadań.</w:t>
+      </w:r>
+    </w:p>
+    <w:p>
+      <w:r>
+        <w:t xml:space="preserve">Satysfakcja z dostarczenia widocznego przyrostu produktu.</w:t>
+      </w:r>
+    </w:p>
+    <w:p>
+      <w:r>
+        <w:t xml:space="preserve">Ogólna atmosfera pracy podczas sprintu zostala oceniona jako: pozytywna i produktywna.</w:t>
+      </w:r>
+    </w:p>
+    <w:p>
+      <w:pPr>
+        <w:pStyle w:val="Heading2"/>
+      </w:pPr>
+      <w:r>
+        <w:rPr>
+          <w:b/>
+        </w:rPr>
+        <w:t xml:space="preserve">3.2. Co poszło dobrze? (Keep doing):</w:t>
+      </w:r>
+    </w:p>
+    <w:p>
+      <w:r>
+        <w:t xml:space="preserve">Dobre rozdzielenie odpowiedźialnosci pomiędzy warstwami backendu.</w:t>
+      </w:r>
+    </w:p>
+    <w:p>
+      <w:r>
+        <w:t xml:space="preserve">Szybkie uzgodnienie wspólnej struktury repozytorium dla backendu, frontendu, baz danych i dokumentacji.</w:t>
+      </w:r>
+    </w:p>
+    <w:p>
+      <w:r>
+        <w:t xml:space="preserve">Konsekwentne stosowanie wzorca CQRS już od pierwszych elementów aplikacji.</w:t>
+      </w:r>
+    </w:p>
+    <w:p>
+      <w:r>
+        <w:t xml:space="preserve">Przygotowanie środowiska developerskiego, ktore ułatwia dalsze pracę całego zespółu.</w:t>
+      </w:r>
+    </w:p>
+    <w:p>
+      <w:r>
+        <w:t xml:space="preserve">Wczesne dodanie kolekcji Bruno jako wspólnego narzędzia do testowania endpointow.</w:t>
+      </w:r>
+    </w:p>
+    <w:p>
+      <w:pPr>
+        <w:pStyle w:val="Heading2"/>
+      </w:pPr>
+      <w:r>
+        <w:rPr>
+          <w:b/>
+        </w:rPr>
+        <w:t xml:space="preserve">3.3. Co wymaga poprawy? (Improve):</w:t>
+      </w:r>
+    </w:p>
+    <w:p>
+      <w:r>
+        <w:t xml:space="preserve">Dokładniejsze ustalanie konwencji nazewniczych na poczatku prac.</w:t>
+      </w:r>
+    </w:p>
+    <w:p>
+      <w:r>
+        <w:t xml:space="preserve">Wcześniejsze sprawdzanie zgodnosci konfiguracji lokalnych środowisk członków zespółu.</w:t>
+      </w:r>
+    </w:p>
+    <w:p>
+      <w:pPr>
+        <w:pStyle w:val="Heading2"/>
+      </w:pPr>
+      <w:r>
+        <w:rPr>
+          <w:b/>
+        </w:rPr>
+        <w:t xml:space="preserve">3.4. Action Items (Zadania naprawcze):</w:t>
+      </w:r>
+    </w:p>
+    <w:p>
+      <w:r>
+        <w:t xml:space="preserve">Spisać krótką listę konwencji projektowych dla nazw folderow, namespace'ow i endpointow.</w:t>
+      </w:r>
+    </w:p>
+    <w:p>
+      <w:r>
+        <w:t xml:space="preserve">Dodac do README sekcje szybkiej weryfikacji środowiska po uruchomieniu projektu.</w:t>
+      </w:r>
+    </w:p>
+    <w:p>
+      <w:pPr>
+        <w:pStyle w:val="Heading2"/>
+      </w:pPr>
+      <w:r>
+        <w:rPr>
+          <w:b/>
+        </w:rPr>
+        <w:t xml:space="preserve">3.5. Podsumowanie retrospektywy</w:t>
+      </w:r>
+    </w:p>
+    <w:p>
+      <w:r>
+        <w:t xml:space="preserve">Przeprowadzona analiza pozwoliła określić najważniejsze sukcesy sprintu, główne problemy wpływające na pracę zespółu, potencjalne usprawnienia procesu oraz działania rekomendowane do wdrożenia w kolejnych iteracjach projektu.</w:t>
+      </w:r>
+    </w:p>
+    <w:p>
+      <w:r>
+        <w:t xml:space="preserve">Najważniejsze wnioski wynikające z retrospektywy:</w:t>
+      </w:r>
+    </w:p>
+    <w:p>
+      <w:r>
+        <w:t xml:space="preserve">Sprint zostal zrealizowany zgodnie z założeniami i osiągnięto pełną zakładaną prędkość 32 SP.</w:t>
+      </w:r>
+    </w:p>
+    <w:p>
+      <w:r>
+        <w:t xml:space="preserve">Zespol otrzymal stabilną podstawę do dalszej implementacji logiki biznesowej.</w:t>
+      </w:r>
+    </w:p>
+    <w:p>
+      <w:r>
+        <w:t xml:space="preserve">Podzial na warstwy oraz zastosowanie CQRS zmniejszają ryzyko chaosu architektonicznego w kolejnych sprintach.</w:t>
+      </w:r>
+    </w:p>
+    <w:p>
+      <w:r>
+        <w:t xml:space="preserve">Przygotowanie dokumentacji, skryptów baz i kolekcji Bruno usprawniło onboarding oraz testowanie API.</w:t>
+      </w:r>
+    </w:p>
+    <w:p>
+      <w:r>
+        <w:t xml:space="preserve">Planowane usprawnienia na kolejny sprint:</w:t>
+      </w:r>
+    </w:p>
+    <w:p>
+      <w:r>
+        <w:t xml:space="preserve">Ujednolicenie konwencji technicznych przed rozpoczęciem implementacji funkcji klienta.</w:t>
+      </w:r>
+    </w:p>
+    <w:p>
+      <w:r>
+        <w:t xml:space="preserve">Systematyczne aktualizowanie kolekcji Bruno razem z rozwojem endpointow.</w:t>
+      </w:r>
+    </w:p>
+    <w:p>
+      <w:r>
+        <w:t xml:space="preserve">Ogólna ocena sprintu: Sprint zakończył się sukcesem, a wszystkie zaplanowane cele zostały osiągnięte zgodnie z harmonogramem.</w:t>
+      </w:r>
+    </w:p>
+    <w:p>
+      <w:pPr>
+        <w:pStyle w:val="Heading1"/>
+      </w:pPr>
+      <w:r>
+        <w:rPr>
+          <w:b/>
+        </w:rPr>
+        <w:t xml:space="preserve">4. Następne kroki</w:t>
+      </w:r>
+    </w:p>
+    <w:p>
+      <w:r>
+        <w:t xml:space="preserve">4.1 Kolejny PO/SM: Jakub Łaszuk</w:t>
+      </w:r>
+    </w:p>
+    <w:p>
+      <w:r>
+        <w:t xml:space="preserve">4.2 Główny cel kolejnego Sprintu: Klient, rejestracja i bezpieczne hasła. Umożliwienie klientowi założenia profilu oraz przygotowanie bezpiecznego przechowywania danych logowania.</w:t>
+      </w:r>
+    </w:p>
     <w:sectPr>
       <w:pgSz w:w="11906" w:h="16838"/>
       <w:pgMar w:top="1417" w:right="1417" w:bottom="1417" w:left="1417" w:header="708" w:footer="708" w:gutter="0"/>
@@ -190,22 +894,490 @@
 </w:document>
 </file>
 
+<file path=word/numbering.xml><?xml version="1.0" encoding="utf-8"?>
+<w:numbering xmlns:wpc="http://schemas.microsoft.com/office/word/2010/wordprocessingCanvas" xmlns:cx="http://schemas.microsoft.com/office/drawing/2014/chartex" xmlns:cx1="http://schemas.microsoft.com/office/drawing/2015/9/8/chartex" xmlns:cx2="http://schemas.microsoft.com/office/drawing/2015/10/21/chartex" xmlns:cx3="http://schemas.microsoft.com/office/drawing/2016/5/9/chartex" xmlns:cx4="http://schemas.microsoft.com/office/drawing/2016/5/10/chartex" xmlns:cx5="http://schemas.microsoft.com/office/drawing/2016/5/11/chartex" xmlns:cx6="http://schemas.microsoft.com/office/drawing/2016/5/12/chartex" xmlns:cx7="http://schemas.microsoft.com/office/drawing/2016/5/13/chartex" xmlns:cx8="http://schemas.microsoft.com/office/drawing/2016/5/14/chartex" xmlns:mc="http://schemas.openxmlformats.org/markup-compatibility/2006" xmlns:aink="http://schemas.microsoft.com/office/drawing/2016/ink" xmlns:am3d="http://schemas.microsoft.com/office/drawing/2017/model3d" xmlns:o="urn:schemas-microsoft-com:office:office" xmlns:oel="http://schemas.microsoft.com/office/2019/extlst" xmlns:r="http://schemas.openxmlformats.org/officeDocument/2006/relationships" xmlns:m="http://schemas.openxmlformats.org/officeDocument/2006/math" xmlns:v="urn:schemas-microsoft-com:vml" xmlns:wp14="http://schemas.microsoft.com/office/word/2010/wordprocessingDrawing" xmlns:wp="http://schemas.openxmlformats.org/drawingml/2006/wordprocessingDrawing" xmlns:w10="urn:schemas-microsoft-com:office:word" xmlns:w="http://schemas.openxmlformats.org/wordprocessingml/2006/main" xmlns:w14="http://schemas.microsoft.com/office/word/2010/wordml" xmlns:w15="http://schemas.microsoft.com/office/word/2012/wordml" xmlns:w16cex="http://schemas.microsoft.com/office/word/2018/wordml/cex" xmlns:w16cid="http://schemas.microsoft.com/office/word/2016/wordml/cid" xmlns:w16="http://schemas.microsoft.com/office/word/2018/wordml" xmlns:w16sdtdh="http://schemas.microsoft.com/office/word/2020/wordml/sdtdatahash" xmlns:w16se="http://schemas.microsoft.com/office/word/2015/wordml/symex" xmlns:wpg="http://schemas.microsoft.com/office/word/2010/wordprocessingGroup" xmlns:wpi="http://schemas.microsoft.com/office/word/2010/wordprocessingInk" xmlns:wne="http://schemas.microsoft.com/office/word/2006/wordml" xmlns:wps="http://schemas.microsoft.com/office/word/2010/wordprocessingShape" mc:Ignorable="w14 w15 w16se w16cid w16 w16cex w16sdtdh wp14">
+  <w:abstractNum w:abstractNumId="0" w15:restartNumberingAfterBreak="0">
+    <w:nsid w:val="013A46EE"/>
+    <w:multiLevelType w:val="hybridMultilevel"/>
+    <w:tmpl w:val="C31243BC"/>
+    <w:lvl w:ilvl="0" w:tplc="04150001">
+      <w:start w:val="1"/>
+      <w:numFmt w:val="bullet"/>
+      <w:lvlText w:val=""/>
+      <w:lvlJc w:val="left"/>
+      <w:pPr>
+        <w:ind w:left="720" w:hanging="360"/>
+      </w:pPr>
+      <w:rPr>
+        <w:rFonts w:ascii="Symbol" w:hAnsi="Symbol" w:hint="default"/>
+      </w:rPr>
+    </w:lvl>
+    <w:lvl w:ilvl="1" w:tplc="04150003" w:tentative="1">
+      <w:start w:val="1"/>
+      <w:numFmt w:val="bullet"/>
+      <w:lvlText w:val="o"/>
+      <w:lvlJc w:val="left"/>
+      <w:pPr>
+        <w:ind w:left="1440" w:hanging="360"/>
+      </w:pPr>
+      <w:rPr>
+        <w:rFonts w:ascii="Courier New" w:hAnsi="Courier New" w:cs="Courier New" w:hint="default"/>
+      </w:rPr>
+    </w:lvl>
+    <w:lvl w:ilvl="2" w:tplc="04150005" w:tentative="1">
+      <w:start w:val="1"/>
+      <w:numFmt w:val="bullet"/>
+      <w:lvlText w:val=""/>
+      <w:lvlJc w:val="left"/>
+      <w:pPr>
+        <w:ind w:left="2160" w:hanging="360"/>
+      </w:pPr>
+      <w:rPr>
+        <w:rFonts w:ascii="Wingdings" w:hAnsi="Wingdings" w:hint="default"/>
+      </w:rPr>
+    </w:lvl>
+    <w:lvl w:ilvl="3" w:tplc="04150001" w:tentative="1">
+      <w:start w:val="1"/>
+      <w:numFmt w:val="bullet"/>
+      <w:lvlText w:val=""/>
+      <w:lvlJc w:val="left"/>
+      <w:pPr>
+        <w:ind w:left="2880" w:hanging="360"/>
+      </w:pPr>
+      <w:rPr>
+        <w:rFonts w:ascii="Symbol" w:hAnsi="Symbol" w:hint="default"/>
+      </w:rPr>
+    </w:lvl>
+    <w:lvl w:ilvl="4" w:tplc="04150003" w:tentative="1">
+      <w:start w:val="1"/>
+      <w:numFmt w:val="bullet"/>
+      <w:lvlText w:val="o"/>
+      <w:lvlJc w:val="left"/>
+      <w:pPr>
+        <w:ind w:left="3600" w:hanging="360"/>
+      </w:pPr>
+      <w:rPr>
+        <w:rFonts w:ascii="Courier New" w:hAnsi="Courier New" w:cs="Courier New" w:hint="default"/>
+      </w:rPr>
+    </w:lvl>
+    <w:lvl w:ilvl="5" w:tplc="04150005" w:tentative="1">
+      <w:start w:val="1"/>
+      <w:numFmt w:val="bullet"/>
+      <w:lvlText w:val=""/>
+      <w:lvlJc w:val="left"/>
+      <w:pPr>
+        <w:ind w:left="4320" w:hanging="360"/>
+      </w:pPr>
+      <w:rPr>
+        <w:rFonts w:ascii="Wingdings" w:hAnsi="Wingdings" w:hint="default"/>
+      </w:rPr>
+    </w:lvl>
+    <w:lvl w:ilvl="6" w:tplc="04150001" w:tentative="1">
+      <w:start w:val="1"/>
+      <w:numFmt w:val="bullet"/>
+      <w:lvlText w:val=""/>
+      <w:lvlJc w:val="left"/>
+      <w:pPr>
+        <w:ind w:left="5040" w:hanging="360"/>
+      </w:pPr>
+      <w:rPr>
+        <w:rFonts w:ascii="Symbol" w:hAnsi="Symbol" w:hint="default"/>
+      </w:rPr>
+    </w:lvl>
+    <w:lvl w:ilvl="7" w:tplc="04150003" w:tentative="1">
+      <w:start w:val="1"/>
+      <w:numFmt w:val="bullet"/>
+      <w:lvlText w:val="o"/>
+      <w:lvlJc w:val="left"/>
+      <w:pPr>
+        <w:ind w:left="5760" w:hanging="360"/>
+      </w:pPr>
+      <w:rPr>
+        <w:rFonts w:ascii="Courier New" w:hAnsi="Courier New" w:cs="Courier New" w:hint="default"/>
+      </w:rPr>
+    </w:lvl>
+    <w:lvl w:ilvl="8" w:tplc="04150005" w:tentative="1">
+      <w:start w:val="1"/>
+      <w:numFmt w:val="bullet"/>
+      <w:lvlText w:val=""/>
+      <w:lvlJc w:val="left"/>
+      <w:pPr>
+        <w:ind w:left="6480" w:hanging="360"/>
+      </w:pPr>
+      <w:rPr>
+        <w:rFonts w:ascii="Wingdings" w:hAnsi="Wingdings" w:hint="default"/>
+      </w:rPr>
+    </w:lvl>
+  </w:abstractNum>
+  <w:abstractNum w:abstractNumId="1" w15:restartNumberingAfterBreak="0">
+    <w:nsid w:val="091E7665"/>
+    <w:multiLevelType w:val="hybridMultilevel"/>
+    <w:tmpl w:val="8704168C"/>
+    <w:lvl w:ilvl="0" w:tplc="04150001">
+      <w:start w:val="1"/>
+      <w:numFmt w:val="bullet"/>
+      <w:lvlText w:val=""/>
+      <w:lvlJc w:val="left"/>
+      <w:pPr>
+        <w:ind w:left="1440" w:hanging="360"/>
+      </w:pPr>
+      <w:rPr>
+        <w:rFonts w:ascii="Symbol" w:hAnsi="Symbol" w:hint="default"/>
+      </w:rPr>
+    </w:lvl>
+    <w:lvl w:ilvl="1" w:tplc="04150003" w:tentative="1">
+      <w:start w:val="1"/>
+      <w:numFmt w:val="bullet"/>
+      <w:lvlText w:val="o"/>
+      <w:lvlJc w:val="left"/>
+      <w:pPr>
+        <w:ind w:left="2160" w:hanging="360"/>
+      </w:pPr>
+      <w:rPr>
+        <w:rFonts w:ascii="Courier New" w:hAnsi="Courier New" w:cs="Courier New" w:hint="default"/>
+      </w:rPr>
+    </w:lvl>
+    <w:lvl w:ilvl="2" w:tplc="04150005" w:tentative="1">
+      <w:start w:val="1"/>
+      <w:numFmt w:val="bullet"/>
+      <w:lvlText w:val=""/>
+      <w:lvlJc w:val="left"/>
+      <w:pPr>
+        <w:ind w:left="2880" w:hanging="360"/>
+      </w:pPr>
+      <w:rPr>
+        <w:rFonts w:ascii="Wingdings" w:hAnsi="Wingdings" w:hint="default"/>
+      </w:rPr>
+    </w:lvl>
+    <w:lvl w:ilvl="3" w:tplc="04150001" w:tentative="1">
+      <w:start w:val="1"/>
+      <w:numFmt w:val="bullet"/>
+      <w:lvlText w:val=""/>
+      <w:lvlJc w:val="left"/>
+      <w:pPr>
+        <w:ind w:left="3600" w:hanging="360"/>
+      </w:pPr>
+      <w:rPr>
+        <w:rFonts w:ascii="Symbol" w:hAnsi="Symbol" w:hint="default"/>
+      </w:rPr>
+    </w:lvl>
+    <w:lvl w:ilvl="4" w:tplc="04150003" w:tentative="1">
+      <w:start w:val="1"/>
+      <w:numFmt w:val="bullet"/>
+      <w:lvlText w:val="o"/>
+      <w:lvlJc w:val="left"/>
+      <w:pPr>
+        <w:ind w:left="4320" w:hanging="360"/>
+      </w:pPr>
+      <w:rPr>
+        <w:rFonts w:ascii="Courier New" w:hAnsi="Courier New" w:cs="Courier New" w:hint="default"/>
+      </w:rPr>
+    </w:lvl>
+    <w:lvl w:ilvl="5" w:tplc="04150005" w:tentative="1">
+      <w:start w:val="1"/>
+      <w:numFmt w:val="bullet"/>
+      <w:lvlText w:val=""/>
+      <w:lvlJc w:val="left"/>
+      <w:pPr>
+        <w:ind w:left="5040" w:hanging="360"/>
+      </w:pPr>
+      <w:rPr>
+        <w:rFonts w:ascii="Wingdings" w:hAnsi="Wingdings" w:hint="default"/>
+      </w:rPr>
+    </w:lvl>
+    <w:lvl w:ilvl="6" w:tplc="04150001" w:tentative="1">
+      <w:start w:val="1"/>
+      <w:numFmt w:val="bullet"/>
+      <w:lvlText w:val=""/>
+      <w:lvlJc w:val="left"/>
+      <w:pPr>
+        <w:ind w:left="5760" w:hanging="360"/>
+      </w:pPr>
+      <w:rPr>
+        <w:rFonts w:ascii="Symbol" w:hAnsi="Symbol" w:hint="default"/>
+      </w:rPr>
+    </w:lvl>
+    <w:lvl w:ilvl="7" w:tplc="04150003" w:tentative="1">
+      <w:start w:val="1"/>
+      <w:numFmt w:val="bullet"/>
+      <w:lvlText w:val="o"/>
+      <w:lvlJc w:val="left"/>
+      <w:pPr>
+        <w:ind w:left="6480" w:hanging="360"/>
+      </w:pPr>
+      <w:rPr>
+        <w:rFonts w:ascii="Courier New" w:hAnsi="Courier New" w:cs="Courier New" w:hint="default"/>
+      </w:rPr>
+    </w:lvl>
+    <w:lvl w:ilvl="8" w:tplc="04150005" w:tentative="1">
+      <w:start w:val="1"/>
+      <w:numFmt w:val="bullet"/>
+      <w:lvlText w:val=""/>
+      <w:lvlJc w:val="left"/>
+      <w:pPr>
+        <w:ind w:left="7200" w:hanging="360"/>
+      </w:pPr>
+      <w:rPr>
+        <w:rFonts w:ascii="Wingdings" w:hAnsi="Wingdings" w:hint="default"/>
+      </w:rPr>
+    </w:lvl>
+  </w:abstractNum>
+  <w:abstractNum w:abstractNumId="2" w15:restartNumberingAfterBreak="0">
+    <w:nsid w:val="0C414708"/>
+    <w:multiLevelType w:val="hybridMultilevel"/>
+    <w:tmpl w:val="6E2287D2"/>
+    <w:lvl w:ilvl="0" w:tplc="04150001">
+      <w:start w:val="1"/>
+      <w:numFmt w:val="bullet"/>
+      <w:lvlText w:val=""/>
+      <w:lvlJc w:val="left"/>
+      <w:pPr>
+        <w:ind w:left="1440" w:hanging="360"/>
+      </w:pPr>
+      <w:rPr>
+        <w:rFonts w:ascii="Symbol" w:hAnsi="Symbol" w:hint="default"/>
+      </w:rPr>
+    </w:lvl>
+    <w:lvl w:ilvl="1" w:tplc="04150003" w:tentative="1">
+      <w:start w:val="1"/>
+      <w:numFmt w:val="bullet"/>
+      <w:lvlText w:val="o"/>
+      <w:lvlJc w:val="left"/>
+      <w:pPr>
+        <w:ind w:left="2160" w:hanging="360"/>
+      </w:pPr>
+      <w:rPr>
+        <w:rFonts w:ascii="Courier New" w:hAnsi="Courier New" w:cs="Courier New" w:hint="default"/>
+      </w:rPr>
+    </w:lvl>
+    <w:lvl w:ilvl="2" w:tplc="04150005" w:tentative="1">
+      <w:start w:val="1"/>
+      <w:numFmt w:val="bullet"/>
+      <w:lvlText w:val=""/>
+      <w:lvlJc w:val="left"/>
+      <w:pPr>
+        <w:ind w:left="2880" w:hanging="360"/>
+      </w:pPr>
+      <w:rPr>
+        <w:rFonts w:ascii="Wingdings" w:hAnsi="Wingdings" w:hint="default"/>
+      </w:rPr>
+    </w:lvl>
+    <w:lvl w:ilvl="3" w:tplc="04150001" w:tentative="1">
+      <w:start w:val="1"/>
+      <w:numFmt w:val="bullet"/>
+      <w:lvlText w:val=""/>
+      <w:lvlJc w:val="left"/>
+      <w:pPr>
+        <w:ind w:left="3600" w:hanging="360"/>
+      </w:pPr>
+      <w:rPr>
+        <w:rFonts w:ascii="Symbol" w:hAnsi="Symbol" w:hint="default"/>
+      </w:rPr>
+    </w:lvl>
+    <w:lvl w:ilvl="4" w:tplc="04150003" w:tentative="1">
+      <w:start w:val="1"/>
+      <w:numFmt w:val="bullet"/>
+      <w:lvlText w:val="o"/>
+      <w:lvlJc w:val="left"/>
+      <w:pPr>
+        <w:ind w:left="4320" w:hanging="360"/>
+      </w:pPr>
+      <w:rPr>
+        <w:rFonts w:ascii="Courier New" w:hAnsi="Courier New" w:cs="Courier New" w:hint="default"/>
+      </w:rPr>
+    </w:lvl>
+    <w:lvl w:ilvl="5" w:tplc="04150005" w:tentative="1">
+      <w:start w:val="1"/>
+      <w:numFmt w:val="bullet"/>
+      <w:lvlText w:val=""/>
+      <w:lvlJc w:val="left"/>
+      <w:pPr>
+        <w:ind w:left="5040" w:hanging="360"/>
+      </w:pPr>
+      <w:rPr>
+        <w:rFonts w:ascii="Wingdings" w:hAnsi="Wingdings" w:hint="default"/>
+      </w:rPr>
+    </w:lvl>
+    <w:lvl w:ilvl="6" w:tplc="04150001" w:tentative="1">
+      <w:start w:val="1"/>
+      <w:numFmt w:val="bullet"/>
+      <w:lvlText w:val=""/>
+      <w:lvlJc w:val="left"/>
+      <w:pPr>
+        <w:ind w:left="5760" w:hanging="360"/>
+      </w:pPr>
+      <w:rPr>
+        <w:rFonts w:ascii="Symbol" w:hAnsi="Symbol" w:hint="default"/>
+      </w:rPr>
+    </w:lvl>
+    <w:lvl w:ilvl="7" w:tplc="04150003" w:tentative="1">
+      <w:start w:val="1"/>
+      <w:numFmt w:val="bullet"/>
+      <w:lvlText w:val="o"/>
+      <w:lvlJc w:val="left"/>
+      <w:pPr>
+        <w:ind w:left="6480" w:hanging="360"/>
+      </w:pPr>
+      <w:rPr>
+        <w:rFonts w:ascii="Courier New" w:hAnsi="Courier New" w:cs="Courier New" w:hint="default"/>
+      </w:rPr>
+    </w:lvl>
+    <w:lvl w:ilvl="8" w:tplc="04150005" w:tentative="1">
+      <w:start w:val="1"/>
+      <w:numFmt w:val="bullet"/>
+      <w:lvlText w:val=""/>
+      <w:lvlJc w:val="left"/>
+      <w:pPr>
+        <w:ind w:left="7200" w:hanging="360"/>
+      </w:pPr>
+      <w:rPr>
+        <w:rFonts w:ascii="Wingdings" w:hAnsi="Wingdings" w:hint="default"/>
+      </w:rPr>
+    </w:lvl>
+  </w:abstractNum>
+  <w:abstractNum w:abstractNumId="3" w15:restartNumberingAfterBreak="0">
+    <w:nsid w:val="2B4071A3"/>
+    <w:multiLevelType w:val="hybridMultilevel"/>
+    <w:tmpl w:val="6FC2E98A"/>
+    <w:lvl w:ilvl="0" w:tplc="04150001">
+      <w:start w:val="1"/>
+      <w:numFmt w:val="bullet"/>
+      <w:lvlText w:val=""/>
+      <w:lvlJc w:val="left"/>
+      <w:pPr>
+        <w:ind w:left="1440" w:hanging="360"/>
+      </w:pPr>
+      <w:rPr>
+        <w:rFonts w:ascii="Symbol" w:hAnsi="Symbol" w:hint="default"/>
+      </w:rPr>
+    </w:lvl>
+    <w:lvl w:ilvl="1" w:tplc="04150003" w:tentative="1">
+      <w:start w:val="1"/>
+      <w:numFmt w:val="bullet"/>
+      <w:lvlText w:val="o"/>
+      <w:lvlJc w:val="left"/>
+      <w:pPr>
+        <w:ind w:left="2160" w:hanging="360"/>
+      </w:pPr>
+      <w:rPr>
+        <w:rFonts w:ascii="Courier New" w:hAnsi="Courier New" w:cs="Courier New" w:hint="default"/>
+      </w:rPr>
+    </w:lvl>
+    <w:lvl w:ilvl="2" w:tplc="04150005" w:tentative="1">
+      <w:start w:val="1"/>
+      <w:numFmt w:val="bullet"/>
+      <w:lvlText w:val=""/>
+      <w:lvlJc w:val="left"/>
+      <w:pPr>
+        <w:ind w:left="2880" w:hanging="360"/>
+      </w:pPr>
+      <w:rPr>
+        <w:rFonts w:ascii="Wingdings" w:hAnsi="Wingdings" w:hint="default"/>
+      </w:rPr>
+    </w:lvl>
+    <w:lvl w:ilvl="3" w:tplc="04150001" w:tentative="1">
+      <w:start w:val="1"/>
+      <w:numFmt w:val="bullet"/>
+      <w:lvlText w:val=""/>
+      <w:lvlJc w:val="left"/>
+      <w:pPr>
+        <w:ind w:left="3600" w:hanging="360"/>
+      </w:pPr>
+      <w:rPr>
+        <w:rFonts w:ascii="Symbol" w:hAnsi="Symbol" w:hint="default"/>
+      </w:rPr>
+    </w:lvl>
+    <w:lvl w:ilvl="4" w:tplc="04150003" w:tentative="1">
+      <w:start w:val="1"/>
+      <w:numFmt w:val="bullet"/>
+      <w:lvlText w:val="o"/>
+      <w:lvlJc w:val="left"/>
+      <w:pPr>
+        <w:ind w:left="4320" w:hanging="360"/>
+      </w:pPr>
+      <w:rPr>
+        <w:rFonts w:ascii="Courier New" w:hAnsi="Courier New" w:cs="Courier New" w:hint="default"/>
+      </w:rPr>
+    </w:lvl>
+    <w:lvl w:ilvl="5" w:tplc="04150005" w:tentative="1">
+      <w:start w:val="1"/>
+      <w:numFmt w:val="bullet"/>
+      <w:lvlText w:val=""/>
+      <w:lvlJc w:val="left"/>
+      <w:pPr>
+        <w:ind w:left="5040" w:hanging="360"/>
+      </w:pPr>
+      <w:rPr>
+        <w:rFonts w:ascii="Wingdings" w:hAnsi="Wingdings" w:hint="default"/>
+      </w:rPr>
+    </w:lvl>
+    <w:lvl w:ilvl="6" w:tplc="04150001" w:tentative="1">
+      <w:start w:val="1"/>
+      <w:numFmt w:val="bullet"/>
+      <w:lvlText w:val=""/>
+      <w:lvlJc w:val="left"/>
+      <w:pPr>
+        <w:ind w:left="5760" w:hanging="360"/>
+      </w:pPr>
+      <w:rPr>
+        <w:rFonts w:ascii="Symbol" w:hAnsi="Symbol" w:hint="default"/>
+      </w:rPr>
+    </w:lvl>
+    <w:lvl w:ilvl="7" w:tplc="04150003" w:tentative="1">
+      <w:start w:val="1"/>
+      <w:numFmt w:val="bullet"/>
+      <w:lvlText w:val="o"/>
+      <w:lvlJc w:val="left"/>
+      <w:pPr>
+        <w:ind w:left="6480" w:hanging="360"/>
+      </w:pPr>
+      <w:rPr>
+        <w:rFonts w:ascii="Courier New" w:hAnsi="Courier New" w:cs="Courier New" w:hint="default"/>
+      </w:rPr>
+    </w:lvl>
+    <w:lvl w:ilvl="8" w:tplc="04150005" w:tentative="1">
+      <w:start w:val="1"/>
+      <w:numFmt w:val="bullet"/>
+      <w:lvlText w:val=""/>
+      <w:lvlJc w:val="left"/>
+      <w:pPr>
+        <w:ind w:left="7200" w:hanging="360"/>
+      </w:pPr>
+      <w:rPr>
+        <w:rFonts w:ascii="Wingdings" w:hAnsi="Wingdings" w:hint="default"/>
+      </w:rPr>
+    </w:lvl>
+  </w:abstractNum>
+  <w:num w:numId="1" w16cid:durableId="92360295">
+    <w:abstractNumId w:val="0"/>
+  </w:num>
+  <w:num w:numId="2" w16cid:durableId="185297293">
+    <w:abstractNumId w:val="2"/>
+  </w:num>
+  <w:num w:numId="3" w16cid:durableId="971443053">
+    <w:abstractNumId w:val="1"/>
+  </w:num>
+  <w:num w:numId="4" w16cid:durableId="329676044">
+    <w:abstractNumId w:val="3"/>
+  </w:num>
+</w:numbering>
+</file>
+
 <file path=word/styles.xml><?xml version="1.0" encoding="utf-8"?>
-<w:styles xmlns:mc="http://schemas.openxmlformats.org/markup-compatibility/2006" xmlns:r="http://schemas.openxmlformats.org/officeDocument/2006/relationships" xmlns:w="http://schemas.openxmlformats.org/wordprocessingml/2006/main" xmlns:w14="http://schemas.microsoft.com/office/word/2010/wordml" xmlns:w15="http://schemas.microsoft.com/office/word/2012/wordml" xmlns:w16cex="http://schemas.microsoft.com/office/word/2018/wordml/cex" xmlns:w16cid="http://schemas.microsoft.com/office/word/2016/wordml/cid" xmlns:w16="http://schemas.microsoft.com/office/word/2018/wordml" xmlns:w16du="http://schemas.microsoft.com/office/word/2023/wordml/word16du" xmlns:w16sdtdh="http://schemas.microsoft.com/office/word/2020/wordml/sdtdatahash" xmlns:w16sdtfl="http://schemas.microsoft.com/office/word/2024/wordml/sdtformatlock" xmlns:w16se="http://schemas.microsoft.com/office/word/2015/wordml/symex" mc:Ignorable="w14 w15 w16se w16cid w16 w16cex w16sdtdh w16sdtfl w16du">
+<w:styles xmlns:mc="http://schemas.openxmlformats.org/markup-compatibility/2006" xmlns:r="http://schemas.openxmlformats.org/officeDocument/2006/relationships" xmlns:w="http://schemas.openxmlformats.org/wordprocessingml/2006/main" xmlns:w14="http://schemas.microsoft.com/office/word/2010/wordml" xmlns:w15="http://schemas.microsoft.com/office/word/2012/wordml" xmlns:w16cex="http://schemas.microsoft.com/office/word/2018/wordml/cex" xmlns:w16cid="http://schemas.microsoft.com/office/word/2016/wordml/cid" xmlns:w16="http://schemas.microsoft.com/office/word/2018/wordml" xmlns:w16sdtdh="http://schemas.microsoft.com/office/word/2020/wordml/sdtdatahash" xmlns:w16se="http://schemas.microsoft.com/office/word/2015/wordml/symex" mc:Ignorable="w14 w15 w16se w16cid w16 w16cex w16sdtdh">
   <w:docDefaults>
     <w:rPrDefault>
       <w:rPr>
         <w:rFonts w:asciiTheme="minorHAnsi" w:eastAsiaTheme="minorHAnsi" w:hAnsiTheme="minorHAnsi" w:cstheme="minorBidi"/>
-        <w:kern w:val="2"/>
-        <w:sz w:val="24"/>
-        <w:szCs w:val="24"/>
+        <w:sz w:val="22"/>
+        <w:szCs w:val="22"/>
         <w:lang w:val="pl-PL" w:eastAsia="en-US" w:bidi="ar-SA"/>
         <w14:ligatures w14:val="standardContextual"/>
       </w:rPr>
     </w:rPrDefault>
     <w:pPrDefault>
       <w:pPr>
-        <w:spacing w:after="160" w:line="278" w:lineRule="auto"/>
+        <w:spacing w:after="160" w:line="259" w:lineRule="auto"/>
       </w:pPr>
     </w:pPrDefault>
   </w:docDefaults>
@@ -587,18 +1759,25 @@
     <w:lsdException w:name="Unresolved Mention" w:semiHidden="1" w:unhideWhenUsed="1"/>
     <w:lsdException w:name="Smart Link" w:semiHidden="1" w:unhideWhenUsed="1"/>
   </w:latentStyles>
-  <w:style w:type="paragraph" w:default="1" w:styleId="Normalny">
+  <w:style w:type="paragraph" w:default="1" w:styleId="Normal">
     <w:name w:val="Normal"/>
     <w:qFormat/>
-  </w:style>
-  <w:style w:type="paragraph" w:styleId="Nagwek1">
+    <w:pPr>
+      <w:spacing w:after="240" w:line="240" w:lineRule="auto"/>
+    </w:pPr>
+    <w:rPr>
+      <w:rFonts w:ascii="Arial" w:hAnsi="Arial" w:cs="Arial"/>
+      <w:sz w:val="26"/>
+    </w:rPr>
+  </w:style>
+  <w:style w:type="paragraph" w:styleId="Heading1">
     <w:name w:val="heading 1"/>
-    <w:basedOn w:val="Normalny"/>
-    <w:next w:val="Normalny"/>
-    <w:link w:val="Nagwek1Znak"/>
+    <w:basedOn w:val="Normal"/>
+    <w:next w:val="Normal"/>
+    <w:link w:val="Heading1Char"/>
     <w:uiPriority w:val="9"/>
     <w:qFormat/>
-    <w:rsid w:val="004061E6"/>
+    <w:rsid w:val="00FF32EB"/>
     <w:pPr>
       <w:keepNext/>
       <w:keepLines/>
@@ -607,21 +1786,21 @@
     </w:pPr>
     <w:rPr>
       <w:rFonts w:asciiTheme="majorHAnsi" w:eastAsiaTheme="majorEastAsia" w:hAnsiTheme="majorHAnsi" w:cstheme="majorBidi"/>
-      <w:color w:val="2F5496" w:themeColor="accent1" w:themeShade="BF"/>
+      <w:color w:val="0F4761" w:themeColor="accent1" w:themeShade="BF"/>
       <w:sz w:val="40"/>
       <w:szCs w:val="40"/>
     </w:rPr>
   </w:style>
-  <w:style w:type="paragraph" w:styleId="Nagwek2">
+  <w:style w:type="paragraph" w:styleId="Heading2">
     <w:name w:val="heading 2"/>
-    <w:basedOn w:val="Normalny"/>
-    <w:next w:val="Normalny"/>
-    <w:link w:val="Nagwek2Znak"/>
+    <w:basedOn w:val="Normal"/>
+    <w:next w:val="Normal"/>
+    <w:link w:val="Heading2Char"/>
     <w:uiPriority w:val="9"/>
     <w:semiHidden/>
     <w:unhideWhenUsed/>
     <w:qFormat/>
-    <w:rsid w:val="004061E6"/>
+    <w:rsid w:val="00FF32EB"/>
     <w:pPr>
       <w:keepNext/>
       <w:keepLines/>
@@ -630,21 +1809,21 @@
     </w:pPr>
     <w:rPr>
       <w:rFonts w:asciiTheme="majorHAnsi" w:eastAsiaTheme="majorEastAsia" w:hAnsiTheme="majorHAnsi" w:cstheme="majorBidi"/>
-      <w:color w:val="2F5496" w:themeColor="accent1" w:themeShade="BF"/>
+      <w:color w:val="0F4761" w:themeColor="accent1" w:themeShade="BF"/>
       <w:sz w:val="32"/>
       <w:szCs w:val="32"/>
     </w:rPr>
   </w:style>
-  <w:style w:type="paragraph" w:styleId="Nagwek3">
+  <w:style w:type="paragraph" w:styleId="Heading3">
     <w:name w:val="heading 3"/>
-    <w:basedOn w:val="Normalny"/>
-    <w:next w:val="Normalny"/>
-    <w:link w:val="Nagwek3Znak"/>
+    <w:basedOn w:val="Normal"/>
+    <w:next w:val="Normal"/>
+    <w:link w:val="Heading3Char"/>
     <w:uiPriority w:val="9"/>
     <w:semiHidden/>
     <w:unhideWhenUsed/>
     <w:qFormat/>
-    <w:rsid w:val="004061E6"/>
+    <w:rsid w:val="00FF32EB"/>
     <w:pPr>
       <w:keepNext/>
       <w:keepLines/>
@@ -653,21 +1832,21 @@
     </w:pPr>
     <w:rPr>
       <w:rFonts w:eastAsiaTheme="majorEastAsia" w:cstheme="majorBidi"/>
-      <w:color w:val="2F5496" w:themeColor="accent1" w:themeShade="BF"/>
+      <w:color w:val="0F4761" w:themeColor="accent1" w:themeShade="BF"/>
       <w:sz w:val="28"/>
       <w:szCs w:val="28"/>
     </w:rPr>
   </w:style>
-  <w:style w:type="paragraph" w:styleId="Nagwek4">
+  <w:style w:type="paragraph" w:styleId="Heading4">
     <w:name w:val="heading 4"/>
-    <w:basedOn w:val="Normalny"/>
-    <w:next w:val="Normalny"/>
-    <w:link w:val="Nagwek4Znak"/>
+    <w:basedOn w:val="Normal"/>
+    <w:next w:val="Normal"/>
+    <w:link w:val="Heading4Char"/>
     <w:uiPriority w:val="9"/>
     <w:semiHidden/>
     <w:unhideWhenUsed/>
     <w:qFormat/>
-    <w:rsid w:val="004061E6"/>
+    <w:rsid w:val="00FF32EB"/>
     <w:pPr>
       <w:keepNext/>
       <w:keepLines/>
@@ -678,19 +1857,19 @@
       <w:rFonts w:eastAsiaTheme="majorEastAsia" w:cstheme="majorBidi"/>
       <w:i/>
       <w:iCs/>
-      <w:color w:val="2F5496" w:themeColor="accent1" w:themeShade="BF"/>
-    </w:rPr>
-  </w:style>
-  <w:style w:type="paragraph" w:styleId="Nagwek5">
+      <w:color w:val="0F4761" w:themeColor="accent1" w:themeShade="BF"/>
+    </w:rPr>
+  </w:style>
+  <w:style w:type="paragraph" w:styleId="Heading5">
     <w:name w:val="heading 5"/>
-    <w:basedOn w:val="Normalny"/>
-    <w:next w:val="Normalny"/>
-    <w:link w:val="Nagwek5Znak"/>
+    <w:basedOn w:val="Normal"/>
+    <w:next w:val="Normal"/>
+    <w:link w:val="Heading5Char"/>
     <w:uiPriority w:val="9"/>
     <w:semiHidden/>
     <w:unhideWhenUsed/>
     <w:qFormat/>
-    <w:rsid w:val="004061E6"/>
+    <w:rsid w:val="00FF32EB"/>
     <w:pPr>
       <w:keepNext/>
       <w:keepLines/>
@@ -699,19 +1878,19 @@
     </w:pPr>
     <w:rPr>
       <w:rFonts w:eastAsiaTheme="majorEastAsia" w:cstheme="majorBidi"/>
-      <w:color w:val="2F5496" w:themeColor="accent1" w:themeShade="BF"/>
-    </w:rPr>
-  </w:style>
-  <w:style w:type="paragraph" w:styleId="Nagwek6">
+      <w:color w:val="0F4761" w:themeColor="accent1" w:themeShade="BF"/>
+    </w:rPr>
+  </w:style>
+  <w:style w:type="paragraph" w:styleId="Heading6">
     <w:name w:val="heading 6"/>
-    <w:basedOn w:val="Normalny"/>
-    <w:next w:val="Normalny"/>
-    <w:link w:val="Nagwek6Znak"/>
+    <w:basedOn w:val="Normal"/>
+    <w:next w:val="Normal"/>
+    <w:link w:val="Heading6Char"/>
     <w:uiPriority w:val="9"/>
     <w:semiHidden/>
     <w:unhideWhenUsed/>
     <w:qFormat/>
-    <w:rsid w:val="004061E6"/>
+    <w:rsid w:val="00FF32EB"/>
     <w:pPr>
       <w:keepNext/>
       <w:keepLines/>
@@ -725,16 +1904,16 @@
       <w:color w:val="595959" w:themeColor="text1" w:themeTint="A6"/>
     </w:rPr>
   </w:style>
-  <w:style w:type="paragraph" w:styleId="Nagwek7">
+  <w:style w:type="paragraph" w:styleId="Heading7">
     <w:name w:val="heading 7"/>
-    <w:basedOn w:val="Normalny"/>
-    <w:next w:val="Normalny"/>
-    <w:link w:val="Nagwek7Znak"/>
+    <w:basedOn w:val="Normal"/>
+    <w:next w:val="Normal"/>
+    <w:link w:val="Heading7Char"/>
     <w:uiPriority w:val="9"/>
     <w:semiHidden/>
     <w:unhideWhenUsed/>
     <w:qFormat/>
-    <w:rsid w:val="004061E6"/>
+    <w:rsid w:val="00FF32EB"/>
     <w:pPr>
       <w:keepNext/>
       <w:keepLines/>
@@ -746,16 +1925,16 @@
       <w:color w:val="595959" w:themeColor="text1" w:themeTint="A6"/>
     </w:rPr>
   </w:style>
-  <w:style w:type="paragraph" w:styleId="Nagwek8">
+  <w:style w:type="paragraph" w:styleId="Heading8">
     <w:name w:val="heading 8"/>
-    <w:basedOn w:val="Normalny"/>
-    <w:next w:val="Normalny"/>
-    <w:link w:val="Nagwek8Znak"/>
+    <w:basedOn w:val="Normal"/>
+    <w:next w:val="Normal"/>
+    <w:link w:val="Heading8Char"/>
     <w:uiPriority w:val="9"/>
     <w:semiHidden/>
     <w:unhideWhenUsed/>
     <w:qFormat/>
-    <w:rsid w:val="004061E6"/>
+    <w:rsid w:val="00FF32EB"/>
     <w:pPr>
       <w:keepNext/>
       <w:keepLines/>
@@ -769,16 +1948,16 @@
       <w:color w:val="272727" w:themeColor="text1" w:themeTint="D8"/>
     </w:rPr>
   </w:style>
-  <w:style w:type="paragraph" w:styleId="Nagwek9">
+  <w:style w:type="paragraph" w:styleId="Heading9">
     <w:name w:val="heading 9"/>
-    <w:basedOn w:val="Normalny"/>
-    <w:next w:val="Normalny"/>
-    <w:link w:val="Nagwek9Znak"/>
+    <w:basedOn w:val="Normal"/>
+    <w:next w:val="Normal"/>
+    <w:link w:val="Heading9Char"/>
     <w:uiPriority w:val="9"/>
     <w:semiHidden/>
     <w:unhideWhenUsed/>
     <w:qFormat/>
-    <w:rsid w:val="004061E6"/>
+    <w:rsid w:val="00FF32EB"/>
     <w:pPr>
       <w:keepNext/>
       <w:keepLines/>
@@ -790,12 +1969,13 @@
       <w:color w:val="272727" w:themeColor="text1" w:themeTint="D8"/>
     </w:rPr>
   </w:style>
-  <w:style w:type="character" w:default="1" w:styleId="Domylnaczcionkaakapitu">
+  <w:style w:type="character" w:default="1" w:styleId="DefaultParagraphFont">
     <w:name w:val="Default Paragraph Font"/>
     <w:uiPriority w:val="1"/>
+    <w:semiHidden/>
     <w:unhideWhenUsed/>
   </w:style>
-  <w:style w:type="table" w:default="1" w:styleId="Standardowy">
+  <w:style w:type="table" w:default="1" w:styleId="TableNormal">
     <w:name w:val="Normal Table"/>
     <w:uiPriority w:val="99"/>
     <w:semiHidden/>
@@ -810,86 +1990,86 @@
       </w:tblCellMar>
     </w:tblPr>
   </w:style>
-  <w:style w:type="numbering" w:default="1" w:styleId="Bezlisty">
+  <w:style w:type="numbering" w:default="1" w:styleId="NoList">
     <w:name w:val="No List"/>
     <w:uiPriority w:val="99"/>
     <w:semiHidden/>
     <w:unhideWhenUsed/>
   </w:style>
-  <w:style w:type="character" w:customStyle="1" w:styleId="Nagwek1Znak">
-    <w:name w:val="Nagłówek 1 Znak"/>
-    <w:basedOn w:val="Domylnaczcionkaakapitu"/>
-    <w:link w:val="Nagwek1"/>
+  <w:style w:type="character" w:customStyle="1" w:styleId="Heading1Char">
+    <w:name w:val="Heading 1 Char"/>
+    <w:basedOn w:val="DefaultParagraphFont"/>
+    <w:link w:val="Heading1"/>
     <w:uiPriority w:val="9"/>
-    <w:rsid w:val="004061E6"/>
+    <w:rsid w:val="00FF32EB"/>
     <w:rPr>
       <w:rFonts w:asciiTheme="majorHAnsi" w:eastAsiaTheme="majorEastAsia" w:hAnsiTheme="majorHAnsi" w:cstheme="majorBidi"/>
-      <w:color w:val="2F5496" w:themeColor="accent1" w:themeShade="BF"/>
+      <w:color w:val="0F4761" w:themeColor="accent1" w:themeShade="BF"/>
       <w:sz w:val="40"/>
       <w:szCs w:val="40"/>
     </w:rPr>
   </w:style>
-  <w:style w:type="character" w:customStyle="1" w:styleId="Nagwek2Znak">
-    <w:name w:val="Nagłówek 2 Znak"/>
-    <w:basedOn w:val="Domylnaczcionkaakapitu"/>
-    <w:link w:val="Nagwek2"/>
+  <w:style w:type="character" w:customStyle="1" w:styleId="Heading2Char">
+    <w:name w:val="Heading 2 Char"/>
+    <w:basedOn w:val="DefaultParagraphFont"/>
+    <w:link w:val="Heading2"/>
     <w:uiPriority w:val="9"/>
     <w:semiHidden/>
-    <w:rsid w:val="004061E6"/>
+    <w:rsid w:val="00FF32EB"/>
     <w:rPr>
       <w:rFonts w:asciiTheme="majorHAnsi" w:eastAsiaTheme="majorEastAsia" w:hAnsiTheme="majorHAnsi" w:cstheme="majorBidi"/>
-      <w:color w:val="2F5496" w:themeColor="accent1" w:themeShade="BF"/>
+      <w:color w:val="0F4761" w:themeColor="accent1" w:themeShade="BF"/>
       <w:sz w:val="32"/>
       <w:szCs w:val="32"/>
     </w:rPr>
   </w:style>
-  <w:style w:type="character" w:customStyle="1" w:styleId="Nagwek3Znak">
-    <w:name w:val="Nagłówek 3 Znak"/>
-    <w:basedOn w:val="Domylnaczcionkaakapitu"/>
-    <w:link w:val="Nagwek3"/>
+  <w:style w:type="character" w:customStyle="1" w:styleId="Heading3Char">
+    <w:name w:val="Heading 3 Char"/>
+    <w:basedOn w:val="DefaultParagraphFont"/>
+    <w:link w:val="Heading3"/>
     <w:uiPriority w:val="9"/>
     <w:semiHidden/>
-    <w:rsid w:val="004061E6"/>
+    <w:rsid w:val="00FF32EB"/>
     <w:rPr>
       <w:rFonts w:eastAsiaTheme="majorEastAsia" w:cstheme="majorBidi"/>
-      <w:color w:val="2F5496" w:themeColor="accent1" w:themeShade="BF"/>
+      <w:color w:val="0F4761" w:themeColor="accent1" w:themeShade="BF"/>
       <w:sz w:val="28"/>
       <w:szCs w:val="28"/>
     </w:rPr>
   </w:style>
-  <w:style w:type="character" w:customStyle="1" w:styleId="Nagwek4Znak">
-    <w:name w:val="Nagłówek 4 Znak"/>
-    <w:basedOn w:val="Domylnaczcionkaakapitu"/>
-    <w:link w:val="Nagwek4"/>
+  <w:style w:type="character" w:customStyle="1" w:styleId="Heading4Char">
+    <w:name w:val="Heading 4 Char"/>
+    <w:basedOn w:val="DefaultParagraphFont"/>
+    <w:link w:val="Heading4"/>
     <w:uiPriority w:val="9"/>
     <w:semiHidden/>
-    <w:rsid w:val="004061E6"/>
+    <w:rsid w:val="00FF32EB"/>
     <w:rPr>
       <w:rFonts w:eastAsiaTheme="majorEastAsia" w:cstheme="majorBidi"/>
       <w:i/>
       <w:iCs/>
-      <w:color w:val="2F5496" w:themeColor="accent1" w:themeShade="BF"/>
-    </w:rPr>
-  </w:style>
-  <w:style w:type="character" w:customStyle="1" w:styleId="Nagwek5Znak">
-    <w:name w:val="Nagłówek 5 Znak"/>
-    <w:basedOn w:val="Domylnaczcionkaakapitu"/>
-    <w:link w:val="Nagwek5"/>
+      <w:color w:val="0F4761" w:themeColor="accent1" w:themeShade="BF"/>
+    </w:rPr>
+  </w:style>
+  <w:style w:type="character" w:customStyle="1" w:styleId="Heading5Char">
+    <w:name w:val="Heading 5 Char"/>
+    <w:basedOn w:val="DefaultParagraphFont"/>
+    <w:link w:val="Heading5"/>
     <w:uiPriority w:val="9"/>
     <w:semiHidden/>
-    <w:rsid w:val="004061E6"/>
+    <w:rsid w:val="00FF32EB"/>
     <w:rPr>
       <w:rFonts w:eastAsiaTheme="majorEastAsia" w:cstheme="majorBidi"/>
-      <w:color w:val="2F5496" w:themeColor="accent1" w:themeShade="BF"/>
-    </w:rPr>
-  </w:style>
-  <w:style w:type="character" w:customStyle="1" w:styleId="Nagwek6Znak">
-    <w:name w:val="Nagłówek 6 Znak"/>
-    <w:basedOn w:val="Domylnaczcionkaakapitu"/>
-    <w:link w:val="Nagwek6"/>
+      <w:color w:val="0F4761" w:themeColor="accent1" w:themeShade="BF"/>
+    </w:rPr>
+  </w:style>
+  <w:style w:type="character" w:customStyle="1" w:styleId="Heading6Char">
+    <w:name w:val="Heading 6 Char"/>
+    <w:basedOn w:val="DefaultParagraphFont"/>
+    <w:link w:val="Heading6"/>
     <w:uiPriority w:val="9"/>
     <w:semiHidden/>
-    <w:rsid w:val="004061E6"/>
+    <w:rsid w:val="00FF32EB"/>
     <w:rPr>
       <w:rFonts w:eastAsiaTheme="majorEastAsia" w:cstheme="majorBidi"/>
       <w:i/>
@@ -897,25 +2077,25 @@
       <w:color w:val="595959" w:themeColor="text1" w:themeTint="A6"/>
     </w:rPr>
   </w:style>
-  <w:style w:type="character" w:customStyle="1" w:styleId="Nagwek7Znak">
-    <w:name w:val="Nagłówek 7 Znak"/>
-    <w:basedOn w:val="Domylnaczcionkaakapitu"/>
-    <w:link w:val="Nagwek7"/>
+  <w:style w:type="character" w:customStyle="1" w:styleId="Heading7Char">
+    <w:name w:val="Heading 7 Char"/>
+    <w:basedOn w:val="DefaultParagraphFont"/>
+    <w:link w:val="Heading7"/>
     <w:uiPriority w:val="9"/>
     <w:semiHidden/>
-    <w:rsid w:val="004061E6"/>
+    <w:rsid w:val="00FF32EB"/>
     <w:rPr>
       <w:rFonts w:eastAsiaTheme="majorEastAsia" w:cstheme="majorBidi"/>
       <w:color w:val="595959" w:themeColor="text1" w:themeTint="A6"/>
     </w:rPr>
   </w:style>
-  <w:style w:type="character" w:customStyle="1" w:styleId="Nagwek8Znak">
-    <w:name w:val="Nagłówek 8 Znak"/>
-    <w:basedOn w:val="Domylnaczcionkaakapitu"/>
-    <w:link w:val="Nagwek8"/>
+  <w:style w:type="character" w:customStyle="1" w:styleId="Heading8Char">
+    <w:name w:val="Heading 8 Char"/>
+    <w:basedOn w:val="DefaultParagraphFont"/>
+    <w:link w:val="Heading8"/>
     <w:uiPriority w:val="9"/>
     <w:semiHidden/>
-    <w:rsid w:val="004061E6"/>
+    <w:rsid w:val="00FF32EB"/>
     <w:rPr>
       <w:rFonts w:eastAsiaTheme="majorEastAsia" w:cstheme="majorBidi"/>
       <w:i/>
@@ -923,28 +2103,28 @@
       <w:color w:val="272727" w:themeColor="text1" w:themeTint="D8"/>
     </w:rPr>
   </w:style>
-  <w:style w:type="character" w:customStyle="1" w:styleId="Nagwek9Znak">
-    <w:name w:val="Nagłówek 9 Znak"/>
-    <w:basedOn w:val="Domylnaczcionkaakapitu"/>
-    <w:link w:val="Nagwek9"/>
+  <w:style w:type="character" w:customStyle="1" w:styleId="Heading9Char">
+    <w:name w:val="Heading 9 Char"/>
+    <w:basedOn w:val="DefaultParagraphFont"/>
+    <w:link w:val="Heading9"/>
     <w:uiPriority w:val="9"/>
     <w:semiHidden/>
-    <w:rsid w:val="004061E6"/>
+    <w:rsid w:val="00FF32EB"/>
     <w:rPr>
       <w:rFonts w:eastAsiaTheme="majorEastAsia" w:cstheme="majorBidi"/>
       <w:color w:val="272727" w:themeColor="text1" w:themeTint="D8"/>
     </w:rPr>
   </w:style>
-  <w:style w:type="paragraph" w:styleId="Tytu">
+  <w:style w:type="paragraph" w:styleId="Title">
     <w:name w:val="Title"/>
-    <w:basedOn w:val="Normalny"/>
-    <w:next w:val="Normalny"/>
-    <w:link w:val="TytuZnak"/>
+    <w:basedOn w:val="Normal"/>
+    <w:next w:val="Normal"/>
+    <w:link w:val="TitleChar"/>
     <w:uiPriority w:val="10"/>
     <w:qFormat/>
-    <w:rsid w:val="004061E6"/>
+    <w:rsid w:val="00FF32EB"/>
     <w:pPr>
-      <w:spacing w:after="80" w:line="240" w:lineRule="auto"/>
+      <w:spacing w:after="80"/>
       <w:contextualSpacing/>
     </w:pPr>
     <w:rPr>
@@ -955,12 +2135,12 @@
       <w:szCs w:val="56"/>
     </w:rPr>
   </w:style>
-  <w:style w:type="character" w:customStyle="1" w:styleId="TytuZnak">
-    <w:name w:val="Tytuł Znak"/>
-    <w:basedOn w:val="Domylnaczcionkaakapitu"/>
-    <w:link w:val="Tytu"/>
+  <w:style w:type="character" w:customStyle="1" w:styleId="TitleChar">
+    <w:name w:val="Title Char"/>
+    <w:basedOn w:val="DefaultParagraphFont"/>
+    <w:link w:val="Title"/>
     <w:uiPriority w:val="10"/>
-    <w:rsid w:val="004061E6"/>
+    <w:rsid w:val="00FF32EB"/>
     <w:rPr>
       <w:rFonts w:asciiTheme="majorHAnsi" w:eastAsiaTheme="majorEastAsia" w:hAnsiTheme="majorHAnsi" w:cstheme="majorBidi"/>
       <w:spacing w:val="-10"/>
@@ -969,14 +2149,14 @@
       <w:szCs w:val="56"/>
     </w:rPr>
   </w:style>
-  <w:style w:type="paragraph" w:styleId="Podtytu">
+  <w:style w:type="paragraph" w:styleId="Subtitle">
     <w:name w:val="Subtitle"/>
-    <w:basedOn w:val="Normalny"/>
-    <w:next w:val="Normalny"/>
-    <w:link w:val="PodtytuZnak"/>
+    <w:basedOn w:val="Normal"/>
+    <w:next w:val="Normal"/>
+    <w:link w:val="SubtitleChar"/>
     <w:uiPriority w:val="11"/>
     <w:qFormat/>
-    <w:rsid w:val="004061E6"/>
+    <w:rsid w:val="00FF32EB"/>
     <w:pPr>
       <w:numPr>
         <w:ilvl w:val="1"/>
@@ -990,12 +2170,12 @@
       <w:szCs w:val="28"/>
     </w:rPr>
   </w:style>
-  <w:style w:type="character" w:customStyle="1" w:styleId="PodtytuZnak">
-    <w:name w:val="Podtytuł Znak"/>
-    <w:basedOn w:val="Domylnaczcionkaakapitu"/>
-    <w:link w:val="Podtytu"/>
+  <w:style w:type="character" w:customStyle="1" w:styleId="SubtitleChar">
+    <w:name w:val="Subtitle Char"/>
+    <w:basedOn w:val="DefaultParagraphFont"/>
+    <w:link w:val="Subtitle"/>
     <w:uiPriority w:val="11"/>
-    <w:rsid w:val="004061E6"/>
+    <w:rsid w:val="00FF32EB"/>
     <w:rPr>
       <w:rFonts w:eastAsiaTheme="majorEastAsia" w:cstheme="majorBidi"/>
       <w:color w:val="595959" w:themeColor="text1" w:themeTint="A6"/>
@@ -1004,14 +2184,14 @@
       <w:szCs w:val="28"/>
     </w:rPr>
   </w:style>
-  <w:style w:type="paragraph" w:styleId="Cytat">
+  <w:style w:type="paragraph" w:styleId="Quote">
     <w:name w:val="Quote"/>
-    <w:basedOn w:val="Normalny"/>
-    <w:next w:val="Normalny"/>
-    <w:link w:val="CytatZnak"/>
+    <w:basedOn w:val="Normal"/>
+    <w:next w:val="Normal"/>
+    <w:link w:val="QuoteChar"/>
     <w:uiPriority w:val="29"/>
     <w:qFormat/>
-    <w:rsid w:val="004061E6"/>
+    <w:rsid w:val="00FF32EB"/>
     <w:pPr>
       <w:spacing w:before="160"/>
       <w:jc w:val="center"/>
@@ -1022,53 +2202,53 @@
       <w:color w:val="404040" w:themeColor="text1" w:themeTint="BF"/>
     </w:rPr>
   </w:style>
-  <w:style w:type="character" w:customStyle="1" w:styleId="CytatZnak">
-    <w:name w:val="Cytat Znak"/>
-    <w:basedOn w:val="Domylnaczcionkaakapitu"/>
-    <w:link w:val="Cytat"/>
+  <w:style w:type="character" w:customStyle="1" w:styleId="QuoteChar">
+    <w:name w:val="Quote Char"/>
+    <w:basedOn w:val="DefaultParagraphFont"/>
+    <w:link w:val="Quote"/>
     <w:uiPriority w:val="29"/>
-    <w:rsid w:val="004061E6"/>
+    <w:rsid w:val="00FF32EB"/>
     <w:rPr>
       <w:i/>
       <w:iCs/>
       <w:color w:val="404040" w:themeColor="text1" w:themeTint="BF"/>
     </w:rPr>
   </w:style>
-  <w:style w:type="paragraph" w:styleId="Akapitzlist">
+  <w:style w:type="paragraph" w:styleId="ListParagraph">
     <w:name w:val="List Paragraph"/>
-    <w:basedOn w:val="Normalny"/>
+    <w:basedOn w:val="Normal"/>
     <w:uiPriority w:val="34"/>
     <w:qFormat/>
-    <w:rsid w:val="004061E6"/>
+    <w:rsid w:val="00FF32EB"/>
     <w:pPr>
       <w:ind w:left="720"/>
       <w:contextualSpacing/>
     </w:pPr>
   </w:style>
-  <w:style w:type="character" w:styleId="Wyrnienieintensywne">
+  <w:style w:type="character" w:styleId="IntenseEmphasis">
     <w:name w:val="Intense Emphasis"/>
-    <w:basedOn w:val="Domylnaczcionkaakapitu"/>
+    <w:basedOn w:val="DefaultParagraphFont"/>
     <w:uiPriority w:val="21"/>
     <w:qFormat/>
-    <w:rsid w:val="004061E6"/>
+    <w:rsid w:val="00FF32EB"/>
     <w:rPr>
       <w:i/>
       <w:iCs/>
-      <w:color w:val="2F5496" w:themeColor="accent1" w:themeShade="BF"/>
-    </w:rPr>
-  </w:style>
-  <w:style w:type="paragraph" w:styleId="Cytatintensywny">
+      <w:color w:val="0F4761" w:themeColor="accent1" w:themeShade="BF"/>
+    </w:rPr>
+  </w:style>
+  <w:style w:type="paragraph" w:styleId="IntenseQuote">
     <w:name w:val="Intense Quote"/>
-    <w:basedOn w:val="Normalny"/>
-    <w:next w:val="Normalny"/>
-    <w:link w:val="CytatintensywnyZnak"/>
+    <w:basedOn w:val="Normal"/>
+    <w:next w:val="Normal"/>
+    <w:link w:val="IntenseQuoteChar"/>
     <w:uiPriority w:val="30"/>
     <w:qFormat/>
-    <w:rsid w:val="004061E6"/>
+    <w:rsid w:val="00FF32EB"/>
     <w:pPr>
       <w:pBdr>
-        <w:top w:val="single" w:sz="4" w:space="10" w:color="2F5496" w:themeColor="accent1" w:themeShade="BF"/>
-        <w:bottom w:val="single" w:sz="4" w:space="10" w:color="2F5496" w:themeColor="accent1" w:themeShade="BF"/>
+        <w:top w:val="single" w:sz="4" w:space="10" w:color="0F4761" w:themeColor="accent1" w:themeShade="BF"/>
+        <w:bottom w:val="single" w:sz="4" w:space="10" w:color="0F4761" w:themeColor="accent1" w:themeShade="BF"/>
       </w:pBdr>
       <w:spacing w:before="360" w:after="360"/>
       <w:ind w:left="864" w:right="864"/>
@@ -1077,32 +2257,32 @@
     <w:rPr>
       <w:i/>
       <w:iCs/>
-      <w:color w:val="2F5496" w:themeColor="accent1" w:themeShade="BF"/>
-    </w:rPr>
-  </w:style>
-  <w:style w:type="character" w:customStyle="1" w:styleId="CytatintensywnyZnak">
-    <w:name w:val="Cytat intensywny Znak"/>
-    <w:basedOn w:val="Domylnaczcionkaakapitu"/>
-    <w:link w:val="Cytatintensywny"/>
+      <w:color w:val="0F4761" w:themeColor="accent1" w:themeShade="BF"/>
+    </w:rPr>
+  </w:style>
+  <w:style w:type="character" w:customStyle="1" w:styleId="IntenseQuoteChar">
+    <w:name w:val="Intense Quote Char"/>
+    <w:basedOn w:val="DefaultParagraphFont"/>
+    <w:link w:val="IntenseQuote"/>
     <w:uiPriority w:val="30"/>
-    <w:rsid w:val="004061E6"/>
+    <w:rsid w:val="00FF32EB"/>
     <w:rPr>
       <w:i/>
       <w:iCs/>
-      <w:color w:val="2F5496" w:themeColor="accent1" w:themeShade="BF"/>
-    </w:rPr>
-  </w:style>
-  <w:style w:type="character" w:styleId="Odwoanieintensywne">
+      <w:color w:val="0F4761" w:themeColor="accent1" w:themeShade="BF"/>
+    </w:rPr>
+  </w:style>
+  <w:style w:type="character" w:styleId="IntenseReference">
     <w:name w:val="Intense Reference"/>
-    <w:basedOn w:val="Domylnaczcionkaakapitu"/>
+    <w:basedOn w:val="DefaultParagraphFont"/>
     <w:uiPriority w:val="32"/>
     <w:qFormat/>
-    <w:rsid w:val="004061E6"/>
+    <w:rsid w:val="00FF32EB"/>
     <w:rPr>
       <w:b/>
       <w:bCs/>
       <w:smallCaps/>
-      <w:color w:val="2F5496" w:themeColor="accent1" w:themeShade="BF"/>
+      <w:color w:val="0F4761" w:themeColor="accent1" w:themeShade="BF"/>
       <w:spacing w:val="5"/>
     </w:rPr>
   </w:style>
@@ -1110,9 +2290,9 @@
 </file>
 
 <file path=word/theme/theme1.xml><?xml version="1.0" encoding="utf-8"?>
-<a:theme xmlns:a="http://schemas.openxmlformats.org/drawingml/2006/main" name="Motyw pakietu Office">
+<a:theme xmlns:a="http://schemas.openxmlformats.org/drawingml/2006/main" name="Office Theme">
   <a:themeElements>
-    <a:clrScheme name="Pakiet Office">
+    <a:clrScheme name="Office">
       <a:dk1>
         <a:sysClr val="windowText" lastClr="000000"/>
       </a:dk1>
@@ -1120,39 +2300,39 @@
         <a:sysClr val="window" lastClr="FFFFFF"/>
       </a:lt1>
       <a:dk2>
-        <a:srgbClr val="44546A"/>
+        <a:srgbClr val="0E2841"/>
       </a:dk2>
       <a:lt2>
-        <a:srgbClr val="E7E6E6"/>
+        <a:srgbClr val="E8E8E8"/>
       </a:lt2>
       <a:accent1>
-        <a:srgbClr val="4472C4"/>
+        <a:srgbClr val="156082"/>
       </a:accent1>
       <a:accent2>
-        <a:srgbClr val="ED7D31"/>
+        <a:srgbClr val="E97132"/>
       </a:accent2>
       <a:accent3>
-        <a:srgbClr val="A5A5A5"/>
+        <a:srgbClr val="196B24"/>
       </a:accent3>
       <a:accent4>
-        <a:srgbClr val="FFC000"/>
+        <a:srgbClr val="0F9ED5"/>
       </a:accent4>
       <a:accent5>
-        <a:srgbClr val="5B9BD5"/>
+        <a:srgbClr val="A02B93"/>
       </a:accent5>
       <a:accent6>
-        <a:srgbClr val="70AD47"/>
+        <a:srgbClr val="4EA72E"/>
       </a:accent6>
       <a:hlink>
-        <a:srgbClr val="0563C1"/>
+        <a:srgbClr val="467886"/>
       </a:hlink>
       <a:folHlink>
-        <a:srgbClr val="954F72"/>
+        <a:srgbClr val="96607D"/>
       </a:folHlink>
     </a:clrScheme>
-    <a:fontScheme name="Pakiet Office">
+    <a:fontScheme name="Office">
       <a:majorFont>
-        <a:latin typeface="Calibri Light" panose="020F0302020204030204"/>
+        <a:latin typeface="Aptos Display" panose="02110004020202020204"/>
         <a:ea typeface=""/>
         <a:cs typeface=""/>
         <a:font script="Jpan" typeface="游ゴシック Light"/>
@@ -1204,10 +2384,10 @@
         <a:font script="Tfng" typeface="Ebrima"/>
       </a:majorFont>
       <a:minorFont>
-        <a:latin typeface="Calibri" panose="020F0502020204030204"/>
+        <a:latin typeface="Aptos" panose="02110004020202020204"/>
         <a:ea typeface=""/>
         <a:cs typeface=""/>
-        <a:font script="Jpan" typeface="游ゴシック"/>
+        <a:font script="Jpan" typeface="游明朝"/>
         <a:font script="Hang" typeface="맑은 고딕"/>
         <a:font script="Hans" typeface="等线"/>
         <a:font script="Hant" typeface="新細明體"/>
@@ -1256,7 +2436,7 @@
         <a:font script="Tfng" typeface="Ebrima"/>
       </a:minorFont>
     </a:fontScheme>
-    <a:fmtScheme name="Pakiet Office">
+    <a:fmtScheme name="Office">
       <a:fillStyleLst>
         <a:solidFill>
           <a:schemeClr val="phClr"/>
@@ -1398,7 +2578,7 @@
   <a:extraClrSchemeLst/>
   <a:extLst>
     <a:ext uri="{05A4C25C-085E-4340-85A3-A5531E510DB2}">
-      <thm15:themeFamily xmlns:thm15="http://schemas.microsoft.com/office/thememl/2012/main" name="Office Theme" id="{62F939B6-93AF-4DB8-9C6B-D6C7DFDC589F}" vid="{4A3C46E8-61CC-4603-A589-7422A47A8E4A}"/>
+      <thm15:themeFamily xmlns:thm15="http://schemas.microsoft.com/office/thememl/2012/main" name="Office Theme" id="{2E142A2C-CD16-42D6-873A-C26D2A0506FA}" vid="{1BDDFF52-6CD6-40A5-AB3C-68EB2F1E4D0A}"/>
     </a:ext>
   </a:extLst>
 </a:theme>

</xml_diff>